<commit_message>
routing part-2 and redux revised
</commit_message>
<xml_diff>
--- a/pics/react routing.docx
+++ b/pics/react routing.docx
@@ -3,6 +3,1784 @@
 <w:document xmlns:wpc="http://schemas.microsoft.com/office/word/2010/wordprocessingCanvas" xmlns:cx="http://schemas.microsoft.com/office/drawing/2014/chartex" xmlns:cx1="http://schemas.microsoft.com/office/drawing/2015/9/8/chartex" xmlns:cx2="http://schemas.microsoft.com/office/drawing/2015/10/21/chartex" xmlns:cx3="http://schemas.microsoft.com/office/drawing/2016/5/9/chartex" xmlns:cx4="http://schemas.microsoft.com/office/drawing/2016/5/10/chartex" xmlns:cx5="http://schemas.microsoft.com/office/drawing/2016/5/11/chartex" xmlns:cx6="http://schemas.microsoft.com/office/drawing/2016/5/12/chartex" xmlns:cx7="http://schemas.microsoft.com/office/drawing/2016/5/13/chartex" xmlns:cx8="http://schemas.microsoft.com/office/drawing/2016/5/14/chartex" xmlns:mc="http://schemas.openxmlformats.org/markup-compatibility/2006" xmlns:aink="http://schemas.microsoft.com/office/drawing/2016/ink" xmlns:am3d="http://schemas.microsoft.com/office/drawing/2017/model3d" xmlns:o="urn:schemas-microsoft-com:office:office" xmlns:oel="http://schemas.microsoft.com/office/2019/extlst" xmlns:r="http://schemas.openxmlformats.org/officeDocument/2006/relationships" xmlns:m="http://schemas.openxmlformats.org/officeDocument/2006/math" xmlns:v="urn:schemas-microsoft-com:vml" xmlns:wp14="http://schemas.microsoft.com/office/word/2010/wordprocessingDrawing" xmlns:wp="http://schemas.openxmlformats.org/drawingml/2006/wordprocessingDrawing" xmlns:w10="urn:schemas-microsoft-com:office:word" xmlns:w="http://schemas.openxmlformats.org/wordprocessingml/2006/main" xmlns:w14="http://schemas.microsoft.com/office/word/2010/wordml" xmlns:w15="http://schemas.microsoft.com/office/word/2012/wordml" xmlns:w16cex="http://schemas.microsoft.com/office/word/2018/wordml/cex" xmlns:w16cid="http://schemas.microsoft.com/office/word/2016/wordml/cid" xmlns:w16="http://schemas.microsoft.com/office/word/2018/wordml" xmlns:w16du="http://schemas.microsoft.com/office/word/2023/wordml/word16du" xmlns:w16sdtdh="http://schemas.microsoft.com/office/word/2020/wordml/sdtdatahash" xmlns:w16sdtfl="http://schemas.microsoft.com/office/word/2024/wordml/sdtformatlock" xmlns:w16se="http://schemas.microsoft.com/office/word/2015/wordml/symex" xmlns:wpg="http://schemas.microsoft.com/office/word/2010/wordprocessingGroup" xmlns:wpi="http://schemas.microsoft.com/office/word/2010/wordprocessingInk" xmlns:wne="http://schemas.microsoft.com/office/word/2006/wordml" xmlns:wps="http://schemas.microsoft.com/office/word/2010/wordprocessingShape" mc:Ignorable="w14 w15 w16se w16cid w16 w16cex w16sdtdh w16sdtfl w16du wp14">
   <w:body>
     <w:p>
+      <w:r>
+        <w:rPr>
+          <w:noProof/>
+        </w:rPr>
+        <mc:AlternateContent>
+          <mc:Choice Requires="wps">
+            <w:drawing>
+              <wp:anchor distT="0" distB="0" distL="114300" distR="114300" simplePos="0" relativeHeight="251734016" behindDoc="0" locked="0" layoutInCell="1" allowOverlap="1" wp14:anchorId="3DA9B1FD" wp14:editId="4FC08290">
+                <wp:simplePos x="0" y="0"/>
+                <wp:positionH relativeFrom="margin">
+                  <wp:posOffset>6158865</wp:posOffset>
+                </wp:positionH>
+                <wp:positionV relativeFrom="paragraph">
+                  <wp:posOffset>2509520</wp:posOffset>
+                </wp:positionV>
+                <wp:extent cx="368300" cy="363855"/>
+                <wp:effectExtent l="0" t="0" r="12700" b="17145"/>
+                <wp:wrapNone/>
+                <wp:docPr id="695488040" name="Rectangle 6"/>
+                <wp:cNvGraphicFramePr/>
+                <a:graphic xmlns:a="http://schemas.openxmlformats.org/drawingml/2006/main">
+                  <a:graphicData uri="http://schemas.microsoft.com/office/word/2010/wordprocessingShape">
+                    <wps:wsp>
+                      <wps:cNvSpPr/>
+                      <wps:spPr>
+                        <a:xfrm>
+                          <a:off x="0" y="0"/>
+                          <a:ext cx="368300" cy="363855"/>
+                        </a:xfrm>
+                        <a:prstGeom prst="rect">
+                          <a:avLst/>
+                        </a:prstGeom>
+                        <a:solidFill>
+                          <a:schemeClr val="accent3">
+                            <a:lumMod val="60000"/>
+                            <a:lumOff val="40000"/>
+                          </a:schemeClr>
+                        </a:solidFill>
+                      </wps:spPr>
+                      <wps:style>
+                        <a:lnRef idx="2">
+                          <a:schemeClr val="accent1">
+                            <a:shade val="15000"/>
+                          </a:schemeClr>
+                        </a:lnRef>
+                        <a:fillRef idx="1">
+                          <a:schemeClr val="accent1"/>
+                        </a:fillRef>
+                        <a:effectRef idx="0">
+                          <a:schemeClr val="accent1"/>
+                        </a:effectRef>
+                        <a:fontRef idx="minor">
+                          <a:schemeClr val="lt1"/>
+                        </a:fontRef>
+                      </wps:style>
+                      <wps:bodyPr rot="0" spcFirstLastPara="0" vertOverflow="overflow" horzOverflow="overflow" vert="horz" wrap="square" lIns="91440" tIns="45720" rIns="91440" bIns="45720" numCol="1" spcCol="0" rtlCol="0" fromWordArt="0" anchor="ctr" anchorCtr="0" forceAA="0" compatLnSpc="1">
+                        <a:prstTxWarp prst="textNoShape">
+                          <a:avLst/>
+                        </a:prstTxWarp>
+                        <a:noAutofit/>
+                      </wps:bodyPr>
+                    </wps:wsp>
+                  </a:graphicData>
+                </a:graphic>
+              </wp:anchor>
+            </w:drawing>
+          </mc:Choice>
+          <mc:Fallback>
+            <w:pict>
+              <v:rect w14:anchorId="545F7752" id="Rectangle 6" o:spid="_x0000_s1026" style="position:absolute;margin-left:484.95pt;margin-top:197.6pt;width:29pt;height:28.65pt;z-index:251734016;visibility:visible;mso-wrap-style:square;mso-wrap-distance-left:9pt;mso-wrap-distance-top:0;mso-wrap-distance-right:9pt;mso-wrap-distance-bottom:0;mso-position-horizontal:absolute;mso-position-horizontal-relative:margin;mso-position-vertical:absolute;mso-position-vertical-relative:text;v-text-anchor:middle" o:gfxdata="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" fillcolor="#47d459 [1942]" strokecolor="#030e13 [484]" strokeweight="1.5pt">
+                <w10:wrap anchorx="margin"/>
+              </v:rect>
+            </w:pict>
+          </mc:Fallback>
+        </mc:AlternateContent>
+      </w:r>
+      <w:r>
+        <w:rPr>
+          <w:noProof/>
+        </w:rPr>
+        <mc:AlternateContent>
+          <mc:Choice Requires="wps">
+            <w:drawing>
+              <wp:anchor distT="0" distB="0" distL="114300" distR="114300" simplePos="0" relativeHeight="251732992" behindDoc="0" locked="0" layoutInCell="1" allowOverlap="1" wp14:anchorId="26ADBD65" wp14:editId="4DC86BA0">
+                <wp:simplePos x="0" y="0"/>
+                <wp:positionH relativeFrom="column">
+                  <wp:posOffset>6129655</wp:posOffset>
+                </wp:positionH>
+                <wp:positionV relativeFrom="paragraph">
+                  <wp:posOffset>2417233</wp:posOffset>
+                </wp:positionV>
+                <wp:extent cx="444500" cy="537634"/>
+                <wp:effectExtent l="0" t="0" r="12700" b="15240"/>
+                <wp:wrapNone/>
+                <wp:docPr id="403837663" name="Rectangle 12"/>
+                <wp:cNvGraphicFramePr/>
+                <a:graphic xmlns:a="http://schemas.openxmlformats.org/drawingml/2006/main">
+                  <a:graphicData uri="http://schemas.microsoft.com/office/word/2010/wordprocessingShape">
+                    <wps:wsp>
+                      <wps:cNvSpPr/>
+                      <wps:spPr>
+                        <a:xfrm>
+                          <a:off x="0" y="0"/>
+                          <a:ext cx="444500" cy="537634"/>
+                        </a:xfrm>
+                        <a:prstGeom prst="rect">
+                          <a:avLst/>
+                        </a:prstGeom>
+                        <a:solidFill>
+                          <a:schemeClr val="accent2">
+                            <a:lumMod val="75000"/>
+                          </a:schemeClr>
+                        </a:solidFill>
+                      </wps:spPr>
+                      <wps:style>
+                        <a:lnRef idx="2">
+                          <a:schemeClr val="accent1">
+                            <a:shade val="15000"/>
+                          </a:schemeClr>
+                        </a:lnRef>
+                        <a:fillRef idx="1">
+                          <a:schemeClr val="accent1"/>
+                        </a:fillRef>
+                        <a:effectRef idx="0">
+                          <a:schemeClr val="accent1"/>
+                        </a:effectRef>
+                        <a:fontRef idx="minor">
+                          <a:schemeClr val="lt1"/>
+                        </a:fontRef>
+                      </wps:style>
+                      <wps:bodyPr rot="0" spcFirstLastPara="0" vertOverflow="overflow" horzOverflow="overflow" vert="horz" wrap="square" lIns="91440" tIns="45720" rIns="91440" bIns="45720" numCol="1" spcCol="0" rtlCol="0" fromWordArt="0" anchor="ctr" anchorCtr="0" forceAA="0" compatLnSpc="1">
+                        <a:prstTxWarp prst="textNoShape">
+                          <a:avLst/>
+                        </a:prstTxWarp>
+                        <a:noAutofit/>
+                      </wps:bodyPr>
+                    </wps:wsp>
+                  </a:graphicData>
+                </a:graphic>
+                <wp14:sizeRelH relativeFrom="margin">
+                  <wp14:pctWidth>0</wp14:pctWidth>
+                </wp14:sizeRelH>
+                <wp14:sizeRelV relativeFrom="margin">
+                  <wp14:pctHeight>0</wp14:pctHeight>
+                </wp14:sizeRelV>
+              </wp:anchor>
+            </w:drawing>
+          </mc:Choice>
+          <mc:Fallback>
+            <w:pict>
+              <v:rect w14:anchorId="375D5CC1" id="Rectangle 12" o:spid="_x0000_s1026" style="position:absolute;margin-left:482.65pt;margin-top:190.35pt;width:35pt;height:42.35pt;z-index:251732992;visibility:visible;mso-wrap-style:square;mso-width-percent:0;mso-height-percent:0;mso-wrap-distance-left:9pt;mso-wrap-distance-top:0;mso-wrap-distance-right:9pt;mso-wrap-distance-bottom:0;mso-position-horizontal:absolute;mso-position-horizontal-relative:text;mso-position-vertical:absolute;mso-position-vertical-relative:text;mso-width-percent:0;mso-height-percent:0;mso-width-relative:margin;mso-height-relative:margin;v-text-anchor:middle" o:gfxdata="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" fillcolor="#bf4e14 [2405]" strokecolor="#030e13 [484]" strokeweight="1.5pt"/>
+            </w:pict>
+          </mc:Fallback>
+        </mc:AlternateContent>
+      </w:r>
+      <w:r>
+        <w:rPr>
+          <w:noProof/>
+        </w:rPr>
+        <mc:AlternateContent>
+          <mc:Choice Requires="wps">
+            <w:drawing>
+              <wp:anchor distT="0" distB="0" distL="114300" distR="114300" simplePos="0" relativeHeight="251730944" behindDoc="0" locked="0" layoutInCell="1" allowOverlap="1" wp14:anchorId="60D62CD0" wp14:editId="0B6F4F39">
+                <wp:simplePos x="0" y="0"/>
+                <wp:positionH relativeFrom="column">
+                  <wp:posOffset>2793999</wp:posOffset>
+                </wp:positionH>
+                <wp:positionV relativeFrom="paragraph">
+                  <wp:posOffset>2345267</wp:posOffset>
+                </wp:positionV>
+                <wp:extent cx="3395133" cy="1333500"/>
+                <wp:effectExtent l="0" t="38100" r="53340" b="19050"/>
+                <wp:wrapNone/>
+                <wp:docPr id="878966924" name="Straight Arrow Connector 47"/>
+                <wp:cNvGraphicFramePr/>
+                <a:graphic xmlns:a="http://schemas.openxmlformats.org/drawingml/2006/main">
+                  <a:graphicData uri="http://schemas.microsoft.com/office/word/2010/wordprocessingShape">
+                    <wps:wsp>
+                      <wps:cNvCnPr/>
+                      <wps:spPr>
+                        <a:xfrm flipV="1">
+                          <a:off x="0" y="0"/>
+                          <a:ext cx="3395133" cy="1333500"/>
+                        </a:xfrm>
+                        <a:prstGeom prst="straightConnector1">
+                          <a:avLst/>
+                        </a:prstGeom>
+                        <a:ln>
+                          <a:tailEnd type="triangle"/>
+                        </a:ln>
+                      </wps:spPr>
+                      <wps:style>
+                        <a:lnRef idx="2">
+                          <a:schemeClr val="accent1"/>
+                        </a:lnRef>
+                        <a:fillRef idx="0">
+                          <a:schemeClr val="accent1"/>
+                        </a:fillRef>
+                        <a:effectRef idx="1">
+                          <a:schemeClr val="accent1"/>
+                        </a:effectRef>
+                        <a:fontRef idx="minor">
+                          <a:schemeClr val="tx1"/>
+                        </a:fontRef>
+                      </wps:style>
+                      <wps:bodyPr/>
+                    </wps:wsp>
+                  </a:graphicData>
+                </a:graphic>
+              </wp:anchor>
+            </w:drawing>
+          </mc:Choice>
+          <mc:Fallback>
+            <w:pict>
+              <v:shapetype w14:anchorId="6B3D2416" id="_x0000_t32" coordsize="21600,21600" o:spt="32" o:oned="t" path="m,l21600,21600e" filled="f">
+                <v:path arrowok="t" fillok="f" o:connecttype="none"/>
+                <o:lock v:ext="edit" shapetype="t"/>
+              </v:shapetype>
+              <v:shape id="Straight Arrow Connector 47" o:spid="_x0000_s1026" type="#_x0000_t32" style="position:absolute;margin-left:220pt;margin-top:184.65pt;width:267.35pt;height:105pt;flip:y;z-index:251730944;visibility:visible;mso-wrap-style:square;mso-wrap-distance-left:9pt;mso-wrap-distance-top:0;mso-wrap-distance-right:9pt;mso-wrap-distance-bottom:0;mso-position-horizontal:absolute;mso-position-horizontal-relative:text;mso-position-vertical:absolute;mso-position-vertical-relative:text" o:gfxdata="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" strokecolor="#156082 [3204]" strokeweight="1.5pt">
+                <v:stroke endarrow="block" joinstyle="miter"/>
+              </v:shape>
+            </w:pict>
+          </mc:Fallback>
+        </mc:AlternateContent>
+      </w:r>
+      <w:r>
+        <w:rPr>
+          <w:noProof/>
+        </w:rPr>
+        <mc:AlternateContent>
+          <mc:Choice Requires="wps">
+            <w:drawing>
+              <wp:anchor distT="0" distB="0" distL="114300" distR="114300" simplePos="0" relativeHeight="251729920" behindDoc="0" locked="0" layoutInCell="1" allowOverlap="1" wp14:anchorId="68C07233" wp14:editId="36E11B92">
+                <wp:simplePos x="0" y="0"/>
+                <wp:positionH relativeFrom="column">
+                  <wp:posOffset>2599267</wp:posOffset>
+                </wp:positionH>
+                <wp:positionV relativeFrom="paragraph">
+                  <wp:posOffset>2336799</wp:posOffset>
+                </wp:positionV>
+                <wp:extent cx="3335866" cy="1236133"/>
+                <wp:effectExtent l="38100" t="0" r="17145" b="59690"/>
+                <wp:wrapNone/>
+                <wp:docPr id="176382420" name="Straight Arrow Connector 46"/>
+                <wp:cNvGraphicFramePr/>
+                <a:graphic xmlns:a="http://schemas.openxmlformats.org/drawingml/2006/main">
+                  <a:graphicData uri="http://schemas.microsoft.com/office/word/2010/wordprocessingShape">
+                    <wps:wsp>
+                      <wps:cNvCnPr/>
+                      <wps:spPr>
+                        <a:xfrm flipH="1">
+                          <a:off x="0" y="0"/>
+                          <a:ext cx="3335866" cy="1236133"/>
+                        </a:xfrm>
+                        <a:prstGeom prst="straightConnector1">
+                          <a:avLst/>
+                        </a:prstGeom>
+                        <a:ln>
+                          <a:tailEnd type="triangle"/>
+                        </a:ln>
+                      </wps:spPr>
+                      <wps:style>
+                        <a:lnRef idx="2">
+                          <a:schemeClr val="accent1"/>
+                        </a:lnRef>
+                        <a:fillRef idx="0">
+                          <a:schemeClr val="accent1"/>
+                        </a:fillRef>
+                        <a:effectRef idx="1">
+                          <a:schemeClr val="accent1"/>
+                        </a:effectRef>
+                        <a:fontRef idx="minor">
+                          <a:schemeClr val="tx1"/>
+                        </a:fontRef>
+                      </wps:style>
+                      <wps:bodyPr/>
+                    </wps:wsp>
+                  </a:graphicData>
+                </a:graphic>
+                <wp14:sizeRelH relativeFrom="margin">
+                  <wp14:pctWidth>0</wp14:pctWidth>
+                </wp14:sizeRelH>
+                <wp14:sizeRelV relativeFrom="margin">
+                  <wp14:pctHeight>0</wp14:pctHeight>
+                </wp14:sizeRelV>
+              </wp:anchor>
+            </w:drawing>
+          </mc:Choice>
+          <mc:Fallback>
+            <w:pict>
+              <v:shape w14:anchorId="3CD06CD7" id="Straight Arrow Connector 46" o:spid="_x0000_s1026" type="#_x0000_t32" style="position:absolute;margin-left:204.65pt;margin-top:184pt;width:262.65pt;height:97.35pt;flip:x;z-index:251729920;visibility:visible;mso-wrap-style:square;mso-width-percent:0;mso-height-percent:0;mso-wrap-distance-left:9pt;mso-wrap-distance-top:0;mso-wrap-distance-right:9pt;mso-wrap-distance-bottom:0;mso-position-horizontal:absolute;mso-position-horizontal-relative:text;mso-position-vertical:absolute;mso-position-vertical-relative:text;mso-width-percent:0;mso-height-percent:0;mso-width-relative:margin;mso-height-relative:margin" o:gfxdata="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" strokecolor="#156082 [3204]" strokeweight="1.5pt">
+                <v:stroke endarrow="block" joinstyle="miter"/>
+              </v:shape>
+            </w:pict>
+          </mc:Fallback>
+        </mc:AlternateContent>
+      </w:r>
+      <w:r>
+        <w:rPr>
+          <w:noProof/>
+        </w:rPr>
+        <mc:AlternateContent>
+          <mc:Choice Requires="wps">
+            <w:drawing>
+              <wp:anchor distT="0" distB="0" distL="114300" distR="114300" simplePos="0" relativeHeight="251728896" behindDoc="0" locked="0" layoutInCell="1" allowOverlap="1" wp14:anchorId="683342E7" wp14:editId="219F9413">
+                <wp:simplePos x="0" y="0"/>
+                <wp:positionH relativeFrom="margin">
+                  <wp:posOffset>6019377</wp:posOffset>
+                </wp:positionH>
+                <wp:positionV relativeFrom="paragraph">
+                  <wp:posOffset>1951143</wp:posOffset>
+                </wp:positionV>
+                <wp:extent cx="368300" cy="363855"/>
+                <wp:effectExtent l="0" t="0" r="12700" b="17145"/>
+                <wp:wrapNone/>
+                <wp:docPr id="474985285" name="Rectangle 6"/>
+                <wp:cNvGraphicFramePr/>
+                <a:graphic xmlns:a="http://schemas.openxmlformats.org/drawingml/2006/main">
+                  <a:graphicData uri="http://schemas.microsoft.com/office/word/2010/wordprocessingShape">
+                    <wps:wsp>
+                      <wps:cNvSpPr/>
+                      <wps:spPr>
+                        <a:xfrm>
+                          <a:off x="0" y="0"/>
+                          <a:ext cx="368300" cy="363855"/>
+                        </a:xfrm>
+                        <a:prstGeom prst="rect">
+                          <a:avLst/>
+                        </a:prstGeom>
+                        <a:solidFill>
+                          <a:schemeClr val="accent3">
+                            <a:lumMod val="60000"/>
+                            <a:lumOff val="40000"/>
+                          </a:schemeClr>
+                        </a:solidFill>
+                      </wps:spPr>
+                      <wps:style>
+                        <a:lnRef idx="2">
+                          <a:schemeClr val="accent1">
+                            <a:shade val="15000"/>
+                          </a:schemeClr>
+                        </a:lnRef>
+                        <a:fillRef idx="1">
+                          <a:schemeClr val="accent1"/>
+                        </a:fillRef>
+                        <a:effectRef idx="0">
+                          <a:schemeClr val="accent1"/>
+                        </a:effectRef>
+                        <a:fontRef idx="minor">
+                          <a:schemeClr val="lt1"/>
+                        </a:fontRef>
+                      </wps:style>
+                      <wps:bodyPr rot="0" spcFirstLastPara="0" vertOverflow="overflow" horzOverflow="overflow" vert="horz" wrap="square" lIns="91440" tIns="45720" rIns="91440" bIns="45720" numCol="1" spcCol="0" rtlCol="0" fromWordArt="0" anchor="ctr" anchorCtr="0" forceAA="0" compatLnSpc="1">
+                        <a:prstTxWarp prst="textNoShape">
+                          <a:avLst/>
+                        </a:prstTxWarp>
+                        <a:noAutofit/>
+                      </wps:bodyPr>
+                    </wps:wsp>
+                  </a:graphicData>
+                </a:graphic>
+              </wp:anchor>
+            </w:drawing>
+          </mc:Choice>
+          <mc:Fallback>
+            <w:pict>
+              <v:rect w14:anchorId="4D057C4D" id="Rectangle 6" o:spid="_x0000_s1026" style="position:absolute;margin-left:473.95pt;margin-top:153.65pt;width:29pt;height:28.65pt;z-index:251728896;visibility:visible;mso-wrap-style:square;mso-wrap-distance-left:9pt;mso-wrap-distance-top:0;mso-wrap-distance-right:9pt;mso-wrap-distance-bottom:0;mso-position-horizontal:absolute;mso-position-horizontal-relative:margin;mso-position-vertical:absolute;mso-position-vertical-relative:text;v-text-anchor:middle" o:gfxdata="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" fillcolor="#47d459 [1942]" strokecolor="#030e13 [484]" strokeweight="1.5pt">
+                <w10:wrap anchorx="margin"/>
+              </v:rect>
+            </w:pict>
+          </mc:Fallback>
+        </mc:AlternateContent>
+      </w:r>
+      <w:r>
+        <w:rPr>
+          <w:noProof/>
+        </w:rPr>
+        <mc:AlternateContent>
+          <mc:Choice Requires="wps">
+            <w:drawing>
+              <wp:anchor distT="0" distB="0" distL="114300" distR="114300" simplePos="0" relativeHeight="251726848" behindDoc="0" locked="0" layoutInCell="1" allowOverlap="1" wp14:anchorId="627B1F5B" wp14:editId="38449E01">
+                <wp:simplePos x="0" y="0"/>
+                <wp:positionH relativeFrom="column">
+                  <wp:posOffset>5990167</wp:posOffset>
+                </wp:positionH>
+                <wp:positionV relativeFrom="paragraph">
+                  <wp:posOffset>1858433</wp:posOffset>
+                </wp:positionV>
+                <wp:extent cx="444500" cy="537634"/>
+                <wp:effectExtent l="0" t="0" r="12700" b="15240"/>
+                <wp:wrapNone/>
+                <wp:docPr id="336729402" name="Rectangle 12"/>
+                <wp:cNvGraphicFramePr/>
+                <a:graphic xmlns:a="http://schemas.openxmlformats.org/drawingml/2006/main">
+                  <a:graphicData uri="http://schemas.microsoft.com/office/word/2010/wordprocessingShape">
+                    <wps:wsp>
+                      <wps:cNvSpPr/>
+                      <wps:spPr>
+                        <a:xfrm>
+                          <a:off x="0" y="0"/>
+                          <a:ext cx="444500" cy="537634"/>
+                        </a:xfrm>
+                        <a:prstGeom prst="rect">
+                          <a:avLst/>
+                        </a:prstGeom>
+                        <a:solidFill>
+                          <a:schemeClr val="accent2">
+                            <a:lumMod val="75000"/>
+                          </a:schemeClr>
+                        </a:solidFill>
+                      </wps:spPr>
+                      <wps:style>
+                        <a:lnRef idx="2">
+                          <a:schemeClr val="accent1">
+                            <a:shade val="15000"/>
+                          </a:schemeClr>
+                        </a:lnRef>
+                        <a:fillRef idx="1">
+                          <a:schemeClr val="accent1"/>
+                        </a:fillRef>
+                        <a:effectRef idx="0">
+                          <a:schemeClr val="accent1"/>
+                        </a:effectRef>
+                        <a:fontRef idx="minor">
+                          <a:schemeClr val="lt1"/>
+                        </a:fontRef>
+                      </wps:style>
+                      <wps:bodyPr rot="0" spcFirstLastPara="0" vertOverflow="overflow" horzOverflow="overflow" vert="horz" wrap="square" lIns="91440" tIns="45720" rIns="91440" bIns="45720" numCol="1" spcCol="0" rtlCol="0" fromWordArt="0" anchor="ctr" anchorCtr="0" forceAA="0" compatLnSpc="1">
+                        <a:prstTxWarp prst="textNoShape">
+                          <a:avLst/>
+                        </a:prstTxWarp>
+                        <a:noAutofit/>
+                      </wps:bodyPr>
+                    </wps:wsp>
+                  </a:graphicData>
+                </a:graphic>
+                <wp14:sizeRelH relativeFrom="margin">
+                  <wp14:pctWidth>0</wp14:pctWidth>
+                </wp14:sizeRelH>
+                <wp14:sizeRelV relativeFrom="margin">
+                  <wp14:pctHeight>0</wp14:pctHeight>
+                </wp14:sizeRelV>
+              </wp:anchor>
+            </w:drawing>
+          </mc:Choice>
+          <mc:Fallback>
+            <w:pict>
+              <v:rect w14:anchorId="25835911" id="Rectangle 12" o:spid="_x0000_s1026" style="position:absolute;margin-left:471.65pt;margin-top:146.35pt;width:35pt;height:42.35pt;z-index:251726848;visibility:visible;mso-wrap-style:square;mso-width-percent:0;mso-height-percent:0;mso-wrap-distance-left:9pt;mso-wrap-distance-top:0;mso-wrap-distance-right:9pt;mso-wrap-distance-bottom:0;mso-position-horizontal:absolute;mso-position-horizontal-relative:text;mso-position-vertical:absolute;mso-position-vertical-relative:text;mso-width-percent:0;mso-height-percent:0;mso-width-relative:margin;mso-height-relative:margin;v-text-anchor:middle" o:gfxdata="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" fillcolor="#bf4e14 [2405]" strokecolor="#030e13 [484]" strokeweight="1.5pt"/>
+            </w:pict>
+          </mc:Fallback>
+        </mc:AlternateContent>
+      </w:r>
+      <w:r>
+        <w:rPr>
+          <w:noProof/>
+        </w:rPr>
+        <mc:AlternateContent>
+          <mc:Choice Requires="wps">
+            <w:drawing>
+              <wp:anchor distT="0" distB="0" distL="114300" distR="114300" simplePos="0" relativeHeight="251724800" behindDoc="0" locked="0" layoutInCell="1" allowOverlap="1" wp14:anchorId="0DEE39D2" wp14:editId="1F690077">
+                <wp:simplePos x="0" y="0"/>
+                <wp:positionH relativeFrom="column">
+                  <wp:posOffset>1591733</wp:posOffset>
+                </wp:positionH>
+                <wp:positionV relativeFrom="paragraph">
+                  <wp:posOffset>381000</wp:posOffset>
+                </wp:positionV>
+                <wp:extent cx="1963844" cy="0"/>
+                <wp:effectExtent l="0" t="76200" r="17780" b="95250"/>
+                <wp:wrapNone/>
+                <wp:docPr id="1057445713" name="Straight Arrow Connector 45"/>
+                <wp:cNvGraphicFramePr/>
+                <a:graphic xmlns:a="http://schemas.openxmlformats.org/drawingml/2006/main">
+                  <a:graphicData uri="http://schemas.microsoft.com/office/word/2010/wordprocessingShape">
+                    <wps:wsp>
+                      <wps:cNvCnPr/>
+                      <wps:spPr>
+                        <a:xfrm>
+                          <a:off x="0" y="0"/>
+                          <a:ext cx="1963844" cy="0"/>
+                        </a:xfrm>
+                        <a:prstGeom prst="straightConnector1">
+                          <a:avLst/>
+                        </a:prstGeom>
+                        <a:ln>
+                          <a:tailEnd type="triangle"/>
+                        </a:ln>
+                      </wps:spPr>
+                      <wps:style>
+                        <a:lnRef idx="2">
+                          <a:schemeClr val="dk1"/>
+                        </a:lnRef>
+                        <a:fillRef idx="0">
+                          <a:schemeClr val="dk1"/>
+                        </a:fillRef>
+                        <a:effectRef idx="1">
+                          <a:schemeClr val="dk1"/>
+                        </a:effectRef>
+                        <a:fontRef idx="minor">
+                          <a:schemeClr val="tx1"/>
+                        </a:fontRef>
+                      </wps:style>
+                      <wps:bodyPr/>
+                    </wps:wsp>
+                  </a:graphicData>
+                </a:graphic>
+              </wp:anchor>
+            </w:drawing>
+          </mc:Choice>
+          <mc:Fallback>
+            <w:pict>
+              <v:shape w14:anchorId="06D50C2C" id="Straight Arrow Connector 45" o:spid="_x0000_s1026" type="#_x0000_t32" style="position:absolute;margin-left:125.35pt;margin-top:30pt;width:154.65pt;height:0;z-index:251724800;visibility:visible;mso-wrap-style:square;mso-wrap-distance-left:9pt;mso-wrap-distance-top:0;mso-wrap-distance-right:9pt;mso-wrap-distance-bottom:0;mso-position-horizontal:absolute;mso-position-horizontal-relative:text;mso-position-vertical:absolute;mso-position-vertical-relative:text" o:gfxdata="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" strokecolor="black [3200]" strokeweight="1.5pt">
+                <v:stroke endarrow="block" joinstyle="miter"/>
+              </v:shape>
+            </w:pict>
+          </mc:Fallback>
+        </mc:AlternateContent>
+      </w:r>
+      <w:r>
+        <w:rPr>
+          <w:noProof/>
+        </w:rPr>
+        <mc:AlternateContent>
+          <mc:Choice Requires="wps">
+            <w:drawing>
+              <wp:anchor distT="0" distB="0" distL="114300" distR="114300" simplePos="0" relativeHeight="251721728" behindDoc="0" locked="0" layoutInCell="1" allowOverlap="1" wp14:anchorId="6EF72BB8" wp14:editId="0F24015A">
+                <wp:simplePos x="0" y="0"/>
+                <wp:positionH relativeFrom="column">
+                  <wp:posOffset>2624243</wp:posOffset>
+                </wp:positionH>
+                <wp:positionV relativeFrom="paragraph">
+                  <wp:posOffset>2882900</wp:posOffset>
+                </wp:positionV>
+                <wp:extent cx="1841500" cy="287867"/>
+                <wp:effectExtent l="0" t="0" r="25400" b="17145"/>
+                <wp:wrapNone/>
+                <wp:docPr id="1880242301" name="Text Box 44"/>
+                <wp:cNvGraphicFramePr/>
+                <a:graphic xmlns:a="http://schemas.openxmlformats.org/drawingml/2006/main">
+                  <a:graphicData uri="http://schemas.microsoft.com/office/word/2010/wordprocessingShape">
+                    <wps:wsp>
+                      <wps:cNvSpPr txBox="1"/>
+                      <wps:spPr>
+                        <a:xfrm>
+                          <a:off x="0" y="0"/>
+                          <a:ext cx="1841500" cy="287867"/>
+                        </a:xfrm>
+                        <a:prstGeom prst="rect">
+                          <a:avLst/>
+                        </a:prstGeom>
+                        <a:solidFill>
+                          <a:schemeClr val="lt1"/>
+                        </a:solidFill>
+                        <a:ln w="6350">
+                          <a:solidFill>
+                            <a:prstClr val="black"/>
+                          </a:solidFill>
+                        </a:ln>
+                      </wps:spPr>
+                      <wps:txbx>
+                        <w:txbxContent>
+                          <w:p>
+                            <w:r>
+                              <w:t>Server-side data fetching</w:t>
+                            </w:r>
+                          </w:p>
+                        </w:txbxContent>
+                      </wps:txbx>
+                      <wps:bodyPr rot="0" spcFirstLastPara="0" vertOverflow="overflow" horzOverflow="overflow" vert="horz" wrap="square" lIns="91440" tIns="45720" rIns="91440" bIns="45720" numCol="1" spcCol="0" rtlCol="0" fromWordArt="0" anchor="t" anchorCtr="0" forceAA="0" compatLnSpc="1">
+                        <a:prstTxWarp prst="textNoShape">
+                          <a:avLst/>
+                        </a:prstTxWarp>
+                        <a:noAutofit/>
+                      </wps:bodyPr>
+                    </wps:wsp>
+                  </a:graphicData>
+                </a:graphic>
+                <wp14:sizeRelH relativeFrom="margin">
+                  <wp14:pctWidth>0</wp14:pctWidth>
+                </wp14:sizeRelH>
+                <wp14:sizeRelV relativeFrom="margin">
+                  <wp14:pctHeight>0</wp14:pctHeight>
+                </wp14:sizeRelV>
+              </wp:anchor>
+            </w:drawing>
+          </mc:Choice>
+          <mc:Fallback>
+            <w:pict>
+              <v:shapetype w14:anchorId="6EF72BB8" id="_x0000_t202" coordsize="21600,21600" o:spt="202" path="m,l,21600r21600,l21600,xe">
+                <v:stroke joinstyle="miter"/>
+                <v:path gradientshapeok="t" o:connecttype="rect"/>
+              </v:shapetype>
+              <v:shape id="Text Box 44" o:spid="_x0000_s1026" type="#_x0000_t202" style="position:absolute;margin-left:206.65pt;margin-top:227pt;width:145pt;height:22.65pt;z-index:251721728;visibility:visible;mso-wrap-style:square;mso-width-percent:0;mso-height-percent:0;mso-wrap-distance-left:9pt;mso-wrap-distance-top:0;mso-wrap-distance-right:9pt;mso-wrap-distance-bottom:0;mso-position-horizontal:absolute;mso-position-horizontal-relative:text;mso-position-vertical:absolute;mso-position-vertical-relative:text;mso-width-percent:0;mso-height-percent:0;mso-width-relative:margin;mso-height-relative:margin;v-text-anchor:top" o:gfxdata="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" fillcolor="white [3201]" strokeweight=".5pt">
+                <v:textbox>
+                  <w:txbxContent>
+                    <w:p>
+                      <w:r>
+                        <w:t>Server-side data fetching</w:t>
+                      </w:r>
+                    </w:p>
+                  </w:txbxContent>
+                </v:textbox>
+              </v:shape>
+            </w:pict>
+          </mc:Fallback>
+        </mc:AlternateContent>
+      </w:r>
+      <w:r>
+        <w:rPr>
+          <w:noProof/>
+        </w:rPr>
+        <mc:AlternateContent>
+          <mc:Choice Requires="wps">
+            <w:drawing>
+              <wp:anchor distT="0" distB="0" distL="114300" distR="114300" simplePos="0" relativeHeight="251723776" behindDoc="0" locked="0" layoutInCell="1" allowOverlap="1" wp14:anchorId="6B4A4693" wp14:editId="471DCAB5">
+                <wp:simplePos x="0" y="0"/>
+                <wp:positionH relativeFrom="column">
+                  <wp:posOffset>4665133</wp:posOffset>
+                </wp:positionH>
+                <wp:positionV relativeFrom="paragraph">
+                  <wp:posOffset>2523067</wp:posOffset>
+                </wp:positionV>
+                <wp:extent cx="1642534" cy="351366"/>
+                <wp:effectExtent l="0" t="0" r="15240" b="10795"/>
+                <wp:wrapNone/>
+                <wp:docPr id="1323651668" name="Text Box 44"/>
+                <wp:cNvGraphicFramePr/>
+                <a:graphic xmlns:a="http://schemas.openxmlformats.org/drawingml/2006/main">
+                  <a:graphicData uri="http://schemas.microsoft.com/office/word/2010/wordprocessingShape">
+                    <wps:wsp>
+                      <wps:cNvSpPr txBox="1"/>
+                      <wps:spPr>
+                        <a:xfrm>
+                          <a:off x="0" y="0"/>
+                          <a:ext cx="1642534" cy="351366"/>
+                        </a:xfrm>
+                        <a:prstGeom prst="rect">
+                          <a:avLst/>
+                        </a:prstGeom>
+                        <a:solidFill>
+                          <a:schemeClr val="lt1"/>
+                        </a:solidFill>
+                        <a:ln w="6350">
+                          <a:solidFill>
+                            <a:prstClr val="black"/>
+                          </a:solidFill>
+                        </a:ln>
+                      </wps:spPr>
+                      <wps:txbx>
+                        <w:txbxContent>
+                          <w:p>
+                            <w:r>
+                              <w:t xml:space="preserve">Server-side </w:t>
+                            </w:r>
+                            <w:r>
+                              <w:t>rendering</w:t>
+                            </w:r>
+                          </w:p>
+                        </w:txbxContent>
+                      </wps:txbx>
+                      <wps:bodyPr rot="0" spcFirstLastPara="0" vertOverflow="overflow" horzOverflow="overflow" vert="horz" wrap="square" lIns="91440" tIns="45720" rIns="91440" bIns="45720" numCol="1" spcCol="0" rtlCol="0" fromWordArt="0" anchor="t" anchorCtr="0" forceAA="0" compatLnSpc="1">
+                        <a:prstTxWarp prst="textNoShape">
+                          <a:avLst/>
+                        </a:prstTxWarp>
+                        <a:noAutofit/>
+                      </wps:bodyPr>
+                    </wps:wsp>
+                  </a:graphicData>
+                </a:graphic>
+                <wp14:sizeRelH relativeFrom="margin">
+                  <wp14:pctWidth>0</wp14:pctWidth>
+                </wp14:sizeRelH>
+                <wp14:sizeRelV relativeFrom="margin">
+                  <wp14:pctHeight>0</wp14:pctHeight>
+                </wp14:sizeRelV>
+              </wp:anchor>
+            </w:drawing>
+          </mc:Choice>
+          <mc:Fallback>
+            <w:pict>
+              <v:shape w14:anchorId="6B4A4693" id="_x0000_s1027" type="#_x0000_t202" style="position:absolute;margin-left:367.35pt;margin-top:198.65pt;width:129.35pt;height:27.65pt;z-index:251723776;visibility:visible;mso-wrap-style:square;mso-width-percent:0;mso-height-percent:0;mso-wrap-distance-left:9pt;mso-wrap-distance-top:0;mso-wrap-distance-right:9pt;mso-wrap-distance-bottom:0;mso-position-horizontal:absolute;mso-position-horizontal-relative:text;mso-position-vertical:absolute;mso-position-vertical-relative:text;mso-width-percent:0;mso-height-percent:0;mso-width-relative:margin;mso-height-relative:margin;v-text-anchor:top" o:gfxdata="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" fillcolor="white [3201]" strokeweight=".5pt">
+                <v:textbox>
+                  <w:txbxContent>
+                    <w:p>
+                      <w:r>
+                        <w:t xml:space="preserve">Server-side </w:t>
+                      </w:r>
+                      <w:r>
+                        <w:t>rendering</w:t>
+                      </w:r>
+                    </w:p>
+                  </w:txbxContent>
+                </v:textbox>
+              </v:shape>
+            </w:pict>
+          </mc:Fallback>
+        </mc:AlternateContent>
+      </w:r>
+      <w:r>
+        <w:rPr>
+          <w:noProof/>
+        </w:rPr>
+        <mc:AlternateContent>
+          <mc:Choice Requires="wps">
+            <w:drawing>
+              <wp:anchor distT="0" distB="0" distL="114300" distR="114300" simplePos="0" relativeHeight="251720704" behindDoc="0" locked="0" layoutInCell="1" allowOverlap="1" wp14:anchorId="77B17945" wp14:editId="6D9A018D">
+                <wp:simplePos x="0" y="0"/>
+                <wp:positionH relativeFrom="column">
+                  <wp:posOffset>2438399</wp:posOffset>
+                </wp:positionH>
+                <wp:positionV relativeFrom="paragraph">
+                  <wp:posOffset>2298700</wp:posOffset>
+                </wp:positionV>
+                <wp:extent cx="2916767" cy="1130300"/>
+                <wp:effectExtent l="0" t="38100" r="55245" b="31750"/>
+                <wp:wrapNone/>
+                <wp:docPr id="2021171999" name="Straight Arrow Connector 43"/>
+                <wp:cNvGraphicFramePr/>
+                <a:graphic xmlns:a="http://schemas.openxmlformats.org/drawingml/2006/main">
+                  <a:graphicData uri="http://schemas.microsoft.com/office/word/2010/wordprocessingShape">
+                    <wps:wsp>
+                      <wps:cNvCnPr/>
+                      <wps:spPr>
+                        <a:xfrm flipV="1">
+                          <a:off x="0" y="0"/>
+                          <a:ext cx="2916767" cy="1130300"/>
+                        </a:xfrm>
+                        <a:prstGeom prst="straightConnector1">
+                          <a:avLst/>
+                        </a:prstGeom>
+                        <a:ln>
+                          <a:tailEnd type="triangle"/>
+                        </a:ln>
+                      </wps:spPr>
+                      <wps:style>
+                        <a:lnRef idx="1">
+                          <a:schemeClr val="accent6"/>
+                        </a:lnRef>
+                        <a:fillRef idx="0">
+                          <a:schemeClr val="accent6"/>
+                        </a:fillRef>
+                        <a:effectRef idx="0">
+                          <a:schemeClr val="accent6"/>
+                        </a:effectRef>
+                        <a:fontRef idx="minor">
+                          <a:schemeClr val="tx1"/>
+                        </a:fontRef>
+                      </wps:style>
+                      <wps:bodyPr/>
+                    </wps:wsp>
+                  </a:graphicData>
+                </a:graphic>
+              </wp:anchor>
+            </w:drawing>
+          </mc:Choice>
+          <mc:Fallback>
+            <w:pict>
+              <v:shape w14:anchorId="132068DB" id="Straight Arrow Connector 43" o:spid="_x0000_s1026" type="#_x0000_t32" style="position:absolute;margin-left:192pt;margin-top:181pt;width:229.65pt;height:89pt;flip:y;z-index:251720704;visibility:visible;mso-wrap-style:square;mso-wrap-distance-left:9pt;mso-wrap-distance-top:0;mso-wrap-distance-right:9pt;mso-wrap-distance-bottom:0;mso-position-horizontal:absolute;mso-position-horizontal-relative:text;mso-position-vertical:absolute;mso-position-vertical-relative:text" o:gfxdata="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" strokecolor="#4ea72e [3209]" strokeweight="1pt">
+                <v:stroke endarrow="block" joinstyle="miter"/>
+              </v:shape>
+            </w:pict>
+          </mc:Fallback>
+        </mc:AlternateContent>
+      </w:r>
+      <w:r>
+        <w:rPr>
+          <w:noProof/>
+        </w:rPr>
+        <mc:AlternateContent>
+          <mc:Choice Requires="wps">
+            <w:drawing>
+              <wp:anchor distT="0" distB="0" distL="114300" distR="114300" simplePos="0" relativeHeight="251719680" behindDoc="0" locked="0" layoutInCell="1" allowOverlap="1" wp14:anchorId="67027029" wp14:editId="5F3ED64E">
+                <wp:simplePos x="0" y="0"/>
+                <wp:positionH relativeFrom="column">
+                  <wp:posOffset>2404533</wp:posOffset>
+                </wp:positionH>
+                <wp:positionV relativeFrom="paragraph">
+                  <wp:posOffset>2285999</wp:posOffset>
+                </wp:positionV>
+                <wp:extent cx="2870200" cy="982133"/>
+                <wp:effectExtent l="38100" t="0" r="25400" b="66040"/>
+                <wp:wrapNone/>
+                <wp:docPr id="1477638649" name="Straight Arrow Connector 42"/>
+                <wp:cNvGraphicFramePr/>
+                <a:graphic xmlns:a="http://schemas.openxmlformats.org/drawingml/2006/main">
+                  <a:graphicData uri="http://schemas.microsoft.com/office/word/2010/wordprocessingShape">
+                    <wps:wsp>
+                      <wps:cNvCnPr/>
+                      <wps:spPr>
+                        <a:xfrm flipH="1">
+                          <a:off x="0" y="0"/>
+                          <a:ext cx="2870200" cy="982133"/>
+                        </a:xfrm>
+                        <a:prstGeom prst="straightConnector1">
+                          <a:avLst/>
+                        </a:prstGeom>
+                        <a:ln>
+                          <a:tailEnd type="triangle"/>
+                        </a:ln>
+                      </wps:spPr>
+                      <wps:style>
+                        <a:lnRef idx="1">
+                          <a:schemeClr val="accent6"/>
+                        </a:lnRef>
+                        <a:fillRef idx="0">
+                          <a:schemeClr val="accent6"/>
+                        </a:fillRef>
+                        <a:effectRef idx="0">
+                          <a:schemeClr val="accent6"/>
+                        </a:effectRef>
+                        <a:fontRef idx="minor">
+                          <a:schemeClr val="tx1"/>
+                        </a:fontRef>
+                      </wps:style>
+                      <wps:bodyPr/>
+                    </wps:wsp>
+                  </a:graphicData>
+                </a:graphic>
+              </wp:anchor>
+            </w:drawing>
+          </mc:Choice>
+          <mc:Fallback>
+            <w:pict>
+              <v:shape w14:anchorId="4E635D53" id="Straight Arrow Connector 42" o:spid="_x0000_s1026" type="#_x0000_t32" style="position:absolute;margin-left:189.35pt;margin-top:180pt;width:226pt;height:77.35pt;flip:x;z-index:251719680;visibility:visible;mso-wrap-style:square;mso-wrap-distance-left:9pt;mso-wrap-distance-top:0;mso-wrap-distance-right:9pt;mso-wrap-distance-bottom:0;mso-position-horizontal:absolute;mso-position-horizontal-relative:text;mso-position-vertical:absolute;mso-position-vertical-relative:text" o:gfxdata="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" strokecolor="#4ea72e [3209]" strokeweight="1pt">
+                <v:stroke endarrow="block" joinstyle="miter"/>
+              </v:shape>
+            </w:pict>
+          </mc:Fallback>
+        </mc:AlternateContent>
+      </w:r>
+      <w:r>
+        <w:rPr>
+          <w:noProof/>
+        </w:rPr>
+        <mc:AlternateContent>
+          <mc:Choice Requires="wps">
+            <w:drawing>
+              <wp:anchor distT="0" distB="0" distL="114300" distR="114300" simplePos="0" relativeHeight="251718656" behindDoc="0" locked="0" layoutInCell="1" allowOverlap="1" wp14:anchorId="460B0720" wp14:editId="7E62A887">
+                <wp:simplePos x="0" y="0"/>
+                <wp:positionH relativeFrom="margin">
+                  <wp:posOffset>5240443</wp:posOffset>
+                </wp:positionH>
+                <wp:positionV relativeFrom="paragraph">
+                  <wp:posOffset>1942676</wp:posOffset>
+                </wp:positionV>
+                <wp:extent cx="368300" cy="363855"/>
+                <wp:effectExtent l="0" t="0" r="12700" b="17145"/>
+                <wp:wrapNone/>
+                <wp:docPr id="1479003981" name="Rectangle 6"/>
+                <wp:cNvGraphicFramePr/>
+                <a:graphic xmlns:a="http://schemas.openxmlformats.org/drawingml/2006/main">
+                  <a:graphicData uri="http://schemas.microsoft.com/office/word/2010/wordprocessingShape">
+                    <wps:wsp>
+                      <wps:cNvSpPr/>
+                      <wps:spPr>
+                        <a:xfrm>
+                          <a:off x="0" y="0"/>
+                          <a:ext cx="368300" cy="363855"/>
+                        </a:xfrm>
+                        <a:prstGeom prst="rect">
+                          <a:avLst/>
+                        </a:prstGeom>
+                        <a:solidFill>
+                          <a:schemeClr val="accent3">
+                            <a:lumMod val="60000"/>
+                            <a:lumOff val="40000"/>
+                          </a:schemeClr>
+                        </a:solidFill>
+                      </wps:spPr>
+                      <wps:style>
+                        <a:lnRef idx="2">
+                          <a:schemeClr val="accent1">
+                            <a:shade val="15000"/>
+                          </a:schemeClr>
+                        </a:lnRef>
+                        <a:fillRef idx="1">
+                          <a:schemeClr val="accent1"/>
+                        </a:fillRef>
+                        <a:effectRef idx="0">
+                          <a:schemeClr val="accent1"/>
+                        </a:effectRef>
+                        <a:fontRef idx="minor">
+                          <a:schemeClr val="lt1"/>
+                        </a:fontRef>
+                      </wps:style>
+                      <wps:bodyPr rot="0" spcFirstLastPara="0" vertOverflow="overflow" horzOverflow="overflow" vert="horz" wrap="square" lIns="91440" tIns="45720" rIns="91440" bIns="45720" numCol="1" spcCol="0" rtlCol="0" fromWordArt="0" anchor="ctr" anchorCtr="0" forceAA="0" compatLnSpc="1">
+                        <a:prstTxWarp prst="textNoShape">
+                          <a:avLst/>
+                        </a:prstTxWarp>
+                        <a:noAutofit/>
+                      </wps:bodyPr>
+                    </wps:wsp>
+                  </a:graphicData>
+                </a:graphic>
+              </wp:anchor>
+            </w:drawing>
+          </mc:Choice>
+          <mc:Fallback>
+            <w:pict>
+              <v:rect w14:anchorId="3E1B2C40" id="Rectangle 6" o:spid="_x0000_s1026" style="position:absolute;margin-left:412.65pt;margin-top:152.95pt;width:29pt;height:28.65pt;z-index:251718656;visibility:visible;mso-wrap-style:square;mso-wrap-distance-left:9pt;mso-wrap-distance-top:0;mso-wrap-distance-right:9pt;mso-wrap-distance-bottom:0;mso-position-horizontal:absolute;mso-position-horizontal-relative:margin;mso-position-vertical:absolute;mso-position-vertical-relative:text;v-text-anchor:middle" o:gfxdata="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" fillcolor="#47d459 [1942]" strokecolor="#030e13 [484]" strokeweight="1.5pt">
+                <w10:wrap anchorx="margin"/>
+              </v:rect>
+            </w:pict>
+          </mc:Fallback>
+        </mc:AlternateContent>
+      </w:r>
+      <w:r>
+        <w:rPr>
+          <w:noProof/>
+        </w:rPr>
+        <mc:AlternateContent>
+          <mc:Choice Requires="wps">
+            <w:drawing>
+              <wp:anchor distT="0" distB="0" distL="114300" distR="114300" simplePos="0" relativeHeight="251716608" behindDoc="0" locked="0" layoutInCell="1" allowOverlap="1" wp14:anchorId="2E8EE66B" wp14:editId="0F1481B9">
+                <wp:simplePos x="0" y="0"/>
+                <wp:positionH relativeFrom="column">
+                  <wp:posOffset>5211233</wp:posOffset>
+                </wp:positionH>
+                <wp:positionV relativeFrom="paragraph">
+                  <wp:posOffset>1875367</wp:posOffset>
+                </wp:positionV>
+                <wp:extent cx="436034" cy="520700"/>
+                <wp:effectExtent l="0" t="0" r="21590" b="12700"/>
+                <wp:wrapNone/>
+                <wp:docPr id="510224605" name="Rectangle 12"/>
+                <wp:cNvGraphicFramePr/>
+                <a:graphic xmlns:a="http://schemas.openxmlformats.org/drawingml/2006/main">
+                  <a:graphicData uri="http://schemas.microsoft.com/office/word/2010/wordprocessingShape">
+                    <wps:wsp>
+                      <wps:cNvSpPr/>
+                      <wps:spPr>
+                        <a:xfrm>
+                          <a:off x="0" y="0"/>
+                          <a:ext cx="436034" cy="520700"/>
+                        </a:xfrm>
+                        <a:prstGeom prst="rect">
+                          <a:avLst/>
+                        </a:prstGeom>
+                        <a:solidFill>
+                          <a:schemeClr val="accent2">
+                            <a:lumMod val="75000"/>
+                          </a:schemeClr>
+                        </a:solidFill>
+                      </wps:spPr>
+                      <wps:style>
+                        <a:lnRef idx="2">
+                          <a:schemeClr val="accent1">
+                            <a:shade val="15000"/>
+                          </a:schemeClr>
+                        </a:lnRef>
+                        <a:fillRef idx="1">
+                          <a:schemeClr val="accent1"/>
+                        </a:fillRef>
+                        <a:effectRef idx="0">
+                          <a:schemeClr val="accent1"/>
+                        </a:effectRef>
+                        <a:fontRef idx="minor">
+                          <a:schemeClr val="lt1"/>
+                        </a:fontRef>
+                      </wps:style>
+                      <wps:bodyPr rot="0" spcFirstLastPara="0" vertOverflow="overflow" horzOverflow="overflow" vert="horz" wrap="square" lIns="91440" tIns="45720" rIns="91440" bIns="45720" numCol="1" spcCol="0" rtlCol="0" fromWordArt="0" anchor="ctr" anchorCtr="0" forceAA="0" compatLnSpc="1">
+                        <a:prstTxWarp prst="textNoShape">
+                          <a:avLst/>
+                        </a:prstTxWarp>
+                        <a:noAutofit/>
+                      </wps:bodyPr>
+                    </wps:wsp>
+                  </a:graphicData>
+                </a:graphic>
+                <wp14:sizeRelH relativeFrom="margin">
+                  <wp14:pctWidth>0</wp14:pctWidth>
+                </wp14:sizeRelH>
+                <wp14:sizeRelV relativeFrom="margin">
+                  <wp14:pctHeight>0</wp14:pctHeight>
+                </wp14:sizeRelV>
+              </wp:anchor>
+            </w:drawing>
+          </mc:Choice>
+          <mc:Fallback>
+            <w:pict>
+              <v:rect w14:anchorId="597E97D8" id="Rectangle 12" o:spid="_x0000_s1026" style="position:absolute;margin-left:410.35pt;margin-top:147.65pt;width:34.35pt;height:41pt;z-index:251716608;visibility:visible;mso-wrap-style:square;mso-width-percent:0;mso-height-percent:0;mso-wrap-distance-left:9pt;mso-wrap-distance-top:0;mso-wrap-distance-right:9pt;mso-wrap-distance-bottom:0;mso-position-horizontal:absolute;mso-position-horizontal-relative:text;mso-position-vertical:absolute;mso-position-vertical-relative:text;mso-width-percent:0;mso-height-percent:0;mso-width-relative:margin;mso-height-relative:margin;v-text-anchor:middle" o:gfxdata="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" fillcolor="#bf4e14 [2405]" strokecolor="#030e13 [484]" strokeweight="1.5pt"/>
+            </w:pict>
+          </mc:Fallback>
+        </mc:AlternateContent>
+      </w:r>
+      <w:r>
+        <w:rPr>
+          <w:noProof/>
+        </w:rPr>
+        <mc:AlternateContent>
+          <mc:Choice Requires="wps">
+            <w:drawing>
+              <wp:anchor distT="0" distB="0" distL="114300" distR="114300" simplePos="0" relativeHeight="251712512" behindDoc="0" locked="0" layoutInCell="1" allowOverlap="1" wp14:anchorId="79534013" wp14:editId="0EBAEBC6">
+                <wp:simplePos x="0" y="0"/>
+                <wp:positionH relativeFrom="column">
+                  <wp:posOffset>4521200</wp:posOffset>
+                </wp:positionH>
+                <wp:positionV relativeFrom="paragraph">
+                  <wp:posOffset>1892300</wp:posOffset>
+                </wp:positionV>
+                <wp:extent cx="499110" cy="541867"/>
+                <wp:effectExtent l="0" t="0" r="15240" b="10795"/>
+                <wp:wrapNone/>
+                <wp:docPr id="1894790905" name="Rectangle 12"/>
+                <wp:cNvGraphicFramePr/>
+                <a:graphic xmlns:a="http://schemas.openxmlformats.org/drawingml/2006/main">
+                  <a:graphicData uri="http://schemas.microsoft.com/office/word/2010/wordprocessingShape">
+                    <wps:wsp>
+                      <wps:cNvSpPr/>
+                      <wps:spPr>
+                        <a:xfrm>
+                          <a:off x="0" y="0"/>
+                          <a:ext cx="499110" cy="541867"/>
+                        </a:xfrm>
+                        <a:prstGeom prst="rect">
+                          <a:avLst/>
+                        </a:prstGeom>
+                        <a:solidFill>
+                          <a:schemeClr val="accent2">
+                            <a:lumMod val="75000"/>
+                          </a:schemeClr>
+                        </a:solidFill>
+                      </wps:spPr>
+                      <wps:style>
+                        <a:lnRef idx="2">
+                          <a:schemeClr val="accent1">
+                            <a:shade val="15000"/>
+                          </a:schemeClr>
+                        </a:lnRef>
+                        <a:fillRef idx="1">
+                          <a:schemeClr val="accent1"/>
+                        </a:fillRef>
+                        <a:effectRef idx="0">
+                          <a:schemeClr val="accent1"/>
+                        </a:effectRef>
+                        <a:fontRef idx="minor">
+                          <a:schemeClr val="lt1"/>
+                        </a:fontRef>
+                      </wps:style>
+                      <wps:bodyPr rot="0" spcFirstLastPara="0" vertOverflow="overflow" horzOverflow="overflow" vert="horz" wrap="square" lIns="91440" tIns="45720" rIns="91440" bIns="45720" numCol="1" spcCol="0" rtlCol="0" fromWordArt="0" anchor="ctr" anchorCtr="0" forceAA="0" compatLnSpc="1">
+                        <a:prstTxWarp prst="textNoShape">
+                          <a:avLst/>
+                        </a:prstTxWarp>
+                        <a:noAutofit/>
+                      </wps:bodyPr>
+                    </wps:wsp>
+                  </a:graphicData>
+                </a:graphic>
+                <wp14:sizeRelH relativeFrom="margin">
+                  <wp14:pctWidth>0</wp14:pctWidth>
+                </wp14:sizeRelH>
+                <wp14:sizeRelV relativeFrom="margin">
+                  <wp14:pctHeight>0</wp14:pctHeight>
+                </wp14:sizeRelV>
+              </wp:anchor>
+            </w:drawing>
+          </mc:Choice>
+          <mc:Fallback>
+            <w:pict>
+              <v:rect w14:anchorId="31CABF15" id="Rectangle 12" o:spid="_x0000_s1026" style="position:absolute;margin-left:356pt;margin-top:149pt;width:39.3pt;height:42.65pt;z-index:251712512;visibility:visible;mso-wrap-style:square;mso-width-percent:0;mso-height-percent:0;mso-wrap-distance-left:9pt;mso-wrap-distance-top:0;mso-wrap-distance-right:9pt;mso-wrap-distance-bottom:0;mso-position-horizontal:absolute;mso-position-horizontal-relative:text;mso-position-vertical:absolute;mso-position-vertical-relative:text;mso-width-percent:0;mso-height-percent:0;mso-width-relative:margin;mso-height-relative:margin;v-text-anchor:middle" o:gfxdata="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" fillcolor="#bf4e14 [2405]" strokecolor="#030e13 [484]" strokeweight="1.5pt"/>
+            </w:pict>
+          </mc:Fallback>
+        </mc:AlternateContent>
+      </w:r>
+      <w:r>
+        <w:rPr>
+          <w:noProof/>
+        </w:rPr>
+        <mc:AlternateContent>
+          <mc:Choice Requires="wps">
+            <w:drawing>
+              <wp:anchor distT="0" distB="0" distL="114300" distR="114300" simplePos="0" relativeHeight="251714560" behindDoc="0" locked="0" layoutInCell="1" allowOverlap="1" wp14:anchorId="2AB0C7C8" wp14:editId="6309919B">
+                <wp:simplePos x="0" y="0"/>
+                <wp:positionH relativeFrom="column">
+                  <wp:posOffset>4575810</wp:posOffset>
+                </wp:positionH>
+                <wp:positionV relativeFrom="paragraph">
+                  <wp:posOffset>1968076</wp:posOffset>
+                </wp:positionV>
+                <wp:extent cx="368300" cy="364067"/>
+                <wp:effectExtent l="0" t="0" r="12700" b="17145"/>
+                <wp:wrapNone/>
+                <wp:docPr id="673274398" name="Rectangle 6"/>
+                <wp:cNvGraphicFramePr/>
+                <a:graphic xmlns:a="http://schemas.openxmlformats.org/drawingml/2006/main">
+                  <a:graphicData uri="http://schemas.microsoft.com/office/word/2010/wordprocessingShape">
+                    <wps:wsp>
+                      <wps:cNvSpPr/>
+                      <wps:spPr>
+                        <a:xfrm>
+                          <a:off x="0" y="0"/>
+                          <a:ext cx="368300" cy="364067"/>
+                        </a:xfrm>
+                        <a:prstGeom prst="rect">
+                          <a:avLst/>
+                        </a:prstGeom>
+                        <a:solidFill>
+                          <a:schemeClr val="accent3">
+                            <a:lumMod val="60000"/>
+                            <a:lumOff val="40000"/>
+                          </a:schemeClr>
+                        </a:solidFill>
+                      </wps:spPr>
+                      <wps:style>
+                        <a:lnRef idx="2">
+                          <a:schemeClr val="accent1">
+                            <a:shade val="15000"/>
+                          </a:schemeClr>
+                        </a:lnRef>
+                        <a:fillRef idx="1">
+                          <a:schemeClr val="accent1"/>
+                        </a:fillRef>
+                        <a:effectRef idx="0">
+                          <a:schemeClr val="accent1"/>
+                        </a:effectRef>
+                        <a:fontRef idx="minor">
+                          <a:schemeClr val="lt1"/>
+                        </a:fontRef>
+                      </wps:style>
+                      <wps:bodyPr rot="0" spcFirstLastPara="0" vertOverflow="overflow" horzOverflow="overflow" vert="horz" wrap="square" lIns="91440" tIns="45720" rIns="91440" bIns="45720" numCol="1" spcCol="0" rtlCol="0" fromWordArt="0" anchor="ctr" anchorCtr="0" forceAA="0" compatLnSpc="1">
+                        <a:prstTxWarp prst="textNoShape">
+                          <a:avLst/>
+                        </a:prstTxWarp>
+                        <a:noAutofit/>
+                      </wps:bodyPr>
+                    </wps:wsp>
+                  </a:graphicData>
+                </a:graphic>
+              </wp:anchor>
+            </w:drawing>
+          </mc:Choice>
+          <mc:Fallback>
+            <w:pict>
+              <v:rect w14:anchorId="3C739E78" id="Rectangle 6" o:spid="_x0000_s1026" style="position:absolute;margin-left:360.3pt;margin-top:154.95pt;width:29pt;height:28.65pt;z-index:251714560;visibility:visible;mso-wrap-style:square;mso-wrap-distance-left:9pt;mso-wrap-distance-top:0;mso-wrap-distance-right:9pt;mso-wrap-distance-bottom:0;mso-position-horizontal:absolute;mso-position-horizontal-relative:text;mso-position-vertical:absolute;mso-position-vertical-relative:text;v-text-anchor:middle" o:gfxdata="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" fillcolor="#47d459 [1942]" strokecolor="#030e13 [484]" strokeweight="1.5pt"/>
+            </w:pict>
+          </mc:Fallback>
+        </mc:AlternateContent>
+      </w:r>
+      <w:r>
+        <w:rPr>
+          <w:noProof/>
+        </w:rPr>
+        <mc:AlternateContent>
+          <mc:Choice Requires="wps">
+            <w:drawing>
+              <wp:anchor distT="0" distB="0" distL="114300" distR="114300" simplePos="0" relativeHeight="251670528" behindDoc="0" locked="0" layoutInCell="1" allowOverlap="1" wp14:anchorId="0E5CFD27" wp14:editId="49327B76">
+                <wp:simplePos x="0" y="0"/>
+                <wp:positionH relativeFrom="column">
+                  <wp:posOffset>-554355</wp:posOffset>
+                </wp:positionH>
+                <wp:positionV relativeFrom="paragraph">
+                  <wp:posOffset>-228600</wp:posOffset>
+                </wp:positionV>
+                <wp:extent cx="3869055" cy="2929255"/>
+                <wp:effectExtent l="0" t="0" r="17145" b="23495"/>
+                <wp:wrapNone/>
+                <wp:docPr id="462035889" name="Rectangle 7"/>
+                <wp:cNvGraphicFramePr/>
+                <a:graphic xmlns:a="http://schemas.openxmlformats.org/drawingml/2006/main">
+                  <a:graphicData uri="http://schemas.microsoft.com/office/word/2010/wordprocessingShape">
+                    <wps:wsp>
+                      <wps:cNvSpPr/>
+                      <wps:spPr>
+                        <a:xfrm>
+                          <a:off x="0" y="0"/>
+                          <a:ext cx="3869055" cy="2929255"/>
+                        </a:xfrm>
+                        <a:prstGeom prst="rect">
+                          <a:avLst/>
+                        </a:prstGeom>
+                      </wps:spPr>
+                      <wps:style>
+                        <a:lnRef idx="2">
+                          <a:schemeClr val="accent1">
+                            <a:shade val="15000"/>
+                          </a:schemeClr>
+                        </a:lnRef>
+                        <a:fillRef idx="1">
+                          <a:schemeClr val="accent1"/>
+                        </a:fillRef>
+                        <a:effectRef idx="0">
+                          <a:schemeClr val="accent1"/>
+                        </a:effectRef>
+                        <a:fontRef idx="minor">
+                          <a:schemeClr val="lt1"/>
+                        </a:fontRef>
+                      </wps:style>
+                      <wps:bodyPr rot="0" spcFirstLastPara="0" vertOverflow="overflow" horzOverflow="overflow" vert="horz" wrap="square" lIns="91440" tIns="45720" rIns="91440" bIns="45720" numCol="1" spcCol="0" rtlCol="0" fromWordArt="0" anchor="ctr" anchorCtr="0" forceAA="0" compatLnSpc="1">
+                        <a:prstTxWarp prst="textNoShape">
+                          <a:avLst/>
+                        </a:prstTxWarp>
+                        <a:noAutofit/>
+                      </wps:bodyPr>
+                    </wps:wsp>
+                  </a:graphicData>
+                </a:graphic>
+                <wp14:sizeRelH relativeFrom="margin">
+                  <wp14:pctWidth>0</wp14:pctWidth>
+                </wp14:sizeRelH>
+                <wp14:sizeRelV relativeFrom="margin">
+                  <wp14:pctHeight>0</wp14:pctHeight>
+                </wp14:sizeRelV>
+              </wp:anchor>
+            </w:drawing>
+          </mc:Choice>
+          <mc:Fallback>
+            <w:pict>
+              <v:rect w14:anchorId="43F7D6A6" id="Rectangle 7" o:spid="_x0000_s1026" style="position:absolute;margin-left:-43.65pt;margin-top:-18pt;width:304.65pt;height:230.65pt;z-index:251670528;visibility:visible;mso-wrap-style:square;mso-width-percent:0;mso-height-percent:0;mso-wrap-distance-left:9pt;mso-wrap-distance-top:0;mso-wrap-distance-right:9pt;mso-wrap-distance-bottom:0;mso-position-horizontal:absolute;mso-position-horizontal-relative:text;mso-position-vertical:absolute;mso-position-vertical-relative:text;mso-width-percent:0;mso-height-percent:0;mso-width-relative:margin;mso-height-relative:margin;v-text-anchor:middle" o:gfxdata="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" fillcolor="#156082 [3204]" strokecolor="#030e13 [484]" strokeweight="1.5pt"/>
+            </w:pict>
+          </mc:Fallback>
+        </mc:AlternateContent>
+      </w:r>
+      <w:r>
+        <w:rPr>
+          <w:noProof/>
+        </w:rPr>
+        <mc:AlternateContent>
+          <mc:Choice Requires="wps">
+            <w:drawing>
+              <wp:anchor distT="0" distB="0" distL="114300" distR="114300" simplePos="0" relativeHeight="251710464" behindDoc="0" locked="0" layoutInCell="1" allowOverlap="1" wp14:anchorId="6B6E0FEE" wp14:editId="38D1364E">
+                <wp:simplePos x="0" y="0"/>
+                <wp:positionH relativeFrom="column">
+                  <wp:posOffset>1528233</wp:posOffset>
+                </wp:positionH>
+                <wp:positionV relativeFrom="paragraph">
+                  <wp:posOffset>2235200</wp:posOffset>
+                </wp:positionV>
+                <wp:extent cx="833967" cy="262467"/>
+                <wp:effectExtent l="0" t="0" r="23495" b="23495"/>
+                <wp:wrapNone/>
+                <wp:docPr id="886908984" name="Rectangle 41"/>
+                <wp:cNvGraphicFramePr/>
+                <a:graphic xmlns:a="http://schemas.openxmlformats.org/drawingml/2006/main">
+                  <a:graphicData uri="http://schemas.microsoft.com/office/word/2010/wordprocessingShape">
+                    <wps:wsp>
+                      <wps:cNvSpPr/>
+                      <wps:spPr>
+                        <a:xfrm>
+                          <a:off x="0" y="0"/>
+                          <a:ext cx="833967" cy="262467"/>
+                        </a:xfrm>
+                        <a:prstGeom prst="rect">
+                          <a:avLst/>
+                        </a:prstGeom>
+                        <a:solidFill>
+                          <a:schemeClr val="accent3">
+                            <a:lumMod val="60000"/>
+                            <a:lumOff val="40000"/>
+                          </a:schemeClr>
+                        </a:solidFill>
+                      </wps:spPr>
+                      <wps:style>
+                        <a:lnRef idx="2">
+                          <a:schemeClr val="accent1">
+                            <a:shade val="15000"/>
+                          </a:schemeClr>
+                        </a:lnRef>
+                        <a:fillRef idx="1">
+                          <a:schemeClr val="accent1"/>
+                        </a:fillRef>
+                        <a:effectRef idx="0">
+                          <a:schemeClr val="accent1"/>
+                        </a:effectRef>
+                        <a:fontRef idx="minor">
+                          <a:schemeClr val="lt1"/>
+                        </a:fontRef>
+                      </wps:style>
+                      <wps:txbx>
+                        <w:txbxContent>
+                          <w:p>
+                            <w:pPr>
+                              <w:jc w:val="center"/>
+                            </w:pPr>
+                            <w:r>
+                              <w:t>service</w:t>
+                            </w:r>
+                          </w:p>
+                        </w:txbxContent>
+                      </wps:txbx>
+                      <wps:bodyPr rot="0" spcFirstLastPara="0" vertOverflow="overflow" horzOverflow="overflow" vert="horz" wrap="square" lIns="91440" tIns="45720" rIns="91440" bIns="45720" numCol="1" spcCol="0" rtlCol="0" fromWordArt="0" anchor="ctr" anchorCtr="0" forceAA="0" compatLnSpc="1">
+                        <a:prstTxWarp prst="textNoShape">
+                          <a:avLst/>
+                        </a:prstTxWarp>
+                        <a:noAutofit/>
+                      </wps:bodyPr>
+                    </wps:wsp>
+                  </a:graphicData>
+                </a:graphic>
+                <wp14:sizeRelH relativeFrom="margin">
+                  <wp14:pctWidth>0</wp14:pctWidth>
+                </wp14:sizeRelH>
+              </wp:anchor>
+            </w:drawing>
+          </mc:Choice>
+          <mc:Fallback>
+            <w:pict>
+              <v:rect w14:anchorId="6B6E0FEE" id="Rectangle 41" o:spid="_x0000_s1028" style="position:absolute;margin-left:120.35pt;margin-top:176pt;width:65.65pt;height:20.65pt;z-index:251710464;visibility:visible;mso-wrap-style:square;mso-width-percent:0;mso-wrap-distance-left:9pt;mso-wrap-distance-top:0;mso-wrap-distance-right:9pt;mso-wrap-distance-bottom:0;mso-position-horizontal:absolute;mso-position-horizontal-relative:text;mso-position-vertical:absolute;mso-position-vertical-relative:text;mso-width-percent:0;mso-width-relative:margin;v-text-anchor:middle" o:gfxdata="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" fillcolor="#47d459 [1942]" strokecolor="#030e13 [484]" strokeweight="1.5pt">
+                <v:textbox>
+                  <w:txbxContent>
+                    <w:p>
+                      <w:pPr>
+                        <w:jc w:val="center"/>
+                      </w:pPr>
+                      <w:r>
+                        <w:t>service</w:t>
+                      </w:r>
+                    </w:p>
+                  </w:txbxContent>
+                </v:textbox>
+              </v:rect>
+            </w:pict>
+          </mc:Fallback>
+        </mc:AlternateContent>
+      </w:r>
+      <w:r>
+        <w:rPr>
+          <w:noProof/>
+        </w:rPr>
+        <mc:AlternateContent>
+          <mc:Choice Requires="wps">
+            <w:drawing>
+              <wp:anchor distT="0" distB="0" distL="114300" distR="114300" simplePos="0" relativeHeight="251709440" behindDoc="0" locked="0" layoutInCell="1" allowOverlap="1" wp14:anchorId="70618688" wp14:editId="496D3958">
+                <wp:simplePos x="0" y="0"/>
+                <wp:positionH relativeFrom="column">
+                  <wp:posOffset>2040467</wp:posOffset>
+                </wp:positionH>
+                <wp:positionV relativeFrom="paragraph">
+                  <wp:posOffset>1375833</wp:posOffset>
+                </wp:positionV>
+                <wp:extent cx="630766" cy="499534"/>
+                <wp:effectExtent l="38100" t="38100" r="17145" b="34290"/>
+                <wp:wrapNone/>
+                <wp:docPr id="2138571278" name="Straight Arrow Connector 40"/>
+                <wp:cNvGraphicFramePr/>
+                <a:graphic xmlns:a="http://schemas.openxmlformats.org/drawingml/2006/main">
+                  <a:graphicData uri="http://schemas.microsoft.com/office/word/2010/wordprocessingShape">
+                    <wps:wsp>
+                      <wps:cNvCnPr/>
+                      <wps:spPr>
+                        <a:xfrm flipH="1" flipV="1">
+                          <a:off x="0" y="0"/>
+                          <a:ext cx="630766" cy="499534"/>
+                        </a:xfrm>
+                        <a:prstGeom prst="straightConnector1">
+                          <a:avLst/>
+                        </a:prstGeom>
+                        <a:ln>
+                          <a:tailEnd type="triangle"/>
+                        </a:ln>
+                      </wps:spPr>
+                      <wps:style>
+                        <a:lnRef idx="2">
+                          <a:schemeClr val="dk1"/>
+                        </a:lnRef>
+                        <a:fillRef idx="0">
+                          <a:schemeClr val="dk1"/>
+                        </a:fillRef>
+                        <a:effectRef idx="1">
+                          <a:schemeClr val="dk1"/>
+                        </a:effectRef>
+                        <a:fontRef idx="minor">
+                          <a:schemeClr val="tx1"/>
+                        </a:fontRef>
+                      </wps:style>
+                      <wps:bodyPr/>
+                    </wps:wsp>
+                  </a:graphicData>
+                </a:graphic>
+              </wp:anchor>
+            </w:drawing>
+          </mc:Choice>
+          <mc:Fallback>
+            <w:pict>
+              <v:shape w14:anchorId="79731840" id="Straight Arrow Connector 40" o:spid="_x0000_s1026" type="#_x0000_t32" style="position:absolute;margin-left:160.65pt;margin-top:108.35pt;width:49.65pt;height:39.35pt;flip:x y;z-index:251709440;visibility:visible;mso-wrap-style:square;mso-wrap-distance-left:9pt;mso-wrap-distance-top:0;mso-wrap-distance-right:9pt;mso-wrap-distance-bottom:0;mso-position-horizontal:absolute;mso-position-horizontal-relative:text;mso-position-vertical:absolute;mso-position-vertical-relative:text" o:gfxdata="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" strokecolor="black [3200]" strokeweight="1.5pt">
+                <v:stroke endarrow="block" joinstyle="miter"/>
+              </v:shape>
+            </w:pict>
+          </mc:Fallback>
+        </mc:AlternateContent>
+      </w:r>
+      <w:r>
+        <w:rPr>
+          <w:noProof/>
+        </w:rPr>
+        <mc:AlternateContent>
+          <mc:Choice Requires="wps">
+            <w:drawing>
+              <wp:anchor distT="0" distB="0" distL="114300" distR="114300" simplePos="0" relativeHeight="251708416" behindDoc="0" locked="0" layoutInCell="1" allowOverlap="1" wp14:anchorId="4D51F5FF" wp14:editId="3F913749">
+                <wp:simplePos x="0" y="0"/>
+                <wp:positionH relativeFrom="column">
+                  <wp:posOffset>2023533</wp:posOffset>
+                </wp:positionH>
+                <wp:positionV relativeFrom="paragraph">
+                  <wp:posOffset>1507067</wp:posOffset>
+                </wp:positionV>
+                <wp:extent cx="596900" cy="516466"/>
+                <wp:effectExtent l="0" t="0" r="69850" b="55245"/>
+                <wp:wrapNone/>
+                <wp:docPr id="267281563" name="Straight Arrow Connector 39"/>
+                <wp:cNvGraphicFramePr/>
+                <a:graphic xmlns:a="http://schemas.openxmlformats.org/drawingml/2006/main">
+                  <a:graphicData uri="http://schemas.microsoft.com/office/word/2010/wordprocessingShape">
+                    <wps:wsp>
+                      <wps:cNvCnPr/>
+                      <wps:spPr>
+                        <a:xfrm>
+                          <a:off x="0" y="0"/>
+                          <a:ext cx="596900" cy="516466"/>
+                        </a:xfrm>
+                        <a:prstGeom prst="straightConnector1">
+                          <a:avLst/>
+                        </a:prstGeom>
+                        <a:ln>
+                          <a:tailEnd type="triangle"/>
+                        </a:ln>
+                      </wps:spPr>
+                      <wps:style>
+                        <a:lnRef idx="2">
+                          <a:schemeClr val="dk1"/>
+                        </a:lnRef>
+                        <a:fillRef idx="0">
+                          <a:schemeClr val="dk1"/>
+                        </a:fillRef>
+                        <a:effectRef idx="1">
+                          <a:schemeClr val="dk1"/>
+                        </a:effectRef>
+                        <a:fontRef idx="minor">
+                          <a:schemeClr val="tx1"/>
+                        </a:fontRef>
+                      </wps:style>
+                      <wps:bodyPr/>
+                    </wps:wsp>
+                  </a:graphicData>
+                </a:graphic>
+              </wp:anchor>
+            </w:drawing>
+          </mc:Choice>
+          <mc:Fallback>
+            <w:pict>
+              <v:shape w14:anchorId="02AB743B" id="Straight Arrow Connector 39" o:spid="_x0000_s1026" type="#_x0000_t32" style="position:absolute;margin-left:159.35pt;margin-top:118.65pt;width:47pt;height:40.65pt;z-index:251708416;visibility:visible;mso-wrap-style:square;mso-wrap-distance-left:9pt;mso-wrap-distance-top:0;mso-wrap-distance-right:9pt;mso-wrap-distance-bottom:0;mso-position-horizontal:absolute;mso-position-horizontal-relative:text;mso-position-vertical:absolute;mso-position-vertical-relative:text" o:gfxdata="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" strokecolor="black [3200]" strokeweight="1.5pt">
+                <v:stroke endarrow="block" joinstyle="miter"/>
+              </v:shape>
+            </w:pict>
+          </mc:Fallback>
+        </mc:AlternateContent>
+      </w:r>
+      <w:r>
+        <w:rPr>
+          <w:noProof/>
+        </w:rPr>
+        <mc:AlternateContent>
+          <mc:Choice Requires="wps">
+            <w:drawing>
+              <wp:anchor distT="0" distB="0" distL="114300" distR="114300" simplePos="0" relativeHeight="251707392" behindDoc="0" locked="0" layoutInCell="1" allowOverlap="1" wp14:anchorId="3ACEECAD" wp14:editId="7DEF12B6">
+                <wp:simplePos x="0" y="0"/>
+                <wp:positionH relativeFrom="column">
+                  <wp:posOffset>2070100</wp:posOffset>
+                </wp:positionH>
+                <wp:positionV relativeFrom="paragraph">
+                  <wp:posOffset>1583267</wp:posOffset>
+                </wp:positionV>
+                <wp:extent cx="59267" cy="1540933"/>
+                <wp:effectExtent l="76200" t="38100" r="36195" b="21590"/>
+                <wp:wrapNone/>
+                <wp:docPr id="1739582594" name="Straight Arrow Connector 38"/>
+                <wp:cNvGraphicFramePr/>
+                <a:graphic xmlns:a="http://schemas.openxmlformats.org/drawingml/2006/main">
+                  <a:graphicData uri="http://schemas.microsoft.com/office/word/2010/wordprocessingShape">
+                    <wps:wsp>
+                      <wps:cNvCnPr/>
+                      <wps:spPr>
+                        <a:xfrm flipH="1" flipV="1">
+                          <a:off x="0" y="0"/>
+                          <a:ext cx="59267" cy="1540933"/>
+                        </a:xfrm>
+                        <a:prstGeom prst="straightConnector1">
+                          <a:avLst/>
+                        </a:prstGeom>
+                        <a:ln>
+                          <a:tailEnd type="triangle"/>
+                        </a:ln>
+                      </wps:spPr>
+                      <wps:style>
+                        <a:lnRef idx="2">
+                          <a:schemeClr val="dk1"/>
+                        </a:lnRef>
+                        <a:fillRef idx="0">
+                          <a:schemeClr val="dk1"/>
+                        </a:fillRef>
+                        <a:effectRef idx="1">
+                          <a:schemeClr val="dk1"/>
+                        </a:effectRef>
+                        <a:fontRef idx="minor">
+                          <a:schemeClr val="tx1"/>
+                        </a:fontRef>
+                      </wps:style>
+                      <wps:bodyPr/>
+                    </wps:wsp>
+                  </a:graphicData>
+                </a:graphic>
+              </wp:anchor>
+            </w:drawing>
+          </mc:Choice>
+          <mc:Fallback>
+            <w:pict>
+              <v:shape w14:anchorId="584ADE04" id="Straight Arrow Connector 38" o:spid="_x0000_s1026" type="#_x0000_t32" style="position:absolute;margin-left:163pt;margin-top:124.65pt;width:4.65pt;height:121.35pt;flip:x y;z-index:251707392;visibility:visible;mso-wrap-style:square;mso-wrap-distance-left:9pt;mso-wrap-distance-top:0;mso-wrap-distance-right:9pt;mso-wrap-distance-bottom:0;mso-position-horizontal:absolute;mso-position-horizontal-relative:text;mso-position-vertical:absolute;mso-position-vertical-relative:text" o:gfxdata="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" strokecolor="black [3200]" strokeweight="1.5pt">
+                <v:stroke endarrow="block" joinstyle="miter"/>
+              </v:shape>
+            </w:pict>
+          </mc:Fallback>
+        </mc:AlternateContent>
+      </w:r>
+      <w:r>
+        <w:rPr>
+          <w:noProof/>
+        </w:rPr>
+        <mc:AlternateContent>
+          <mc:Choice Requires="wps">
+            <w:drawing>
+              <wp:anchor distT="0" distB="0" distL="114300" distR="114300" simplePos="0" relativeHeight="251706368" behindDoc="0" locked="0" layoutInCell="1" allowOverlap="1" wp14:anchorId="46A77A9F" wp14:editId="379F9C14">
+                <wp:simplePos x="0" y="0"/>
+                <wp:positionH relativeFrom="column">
+                  <wp:posOffset>1583267</wp:posOffset>
+                </wp:positionH>
+                <wp:positionV relativeFrom="paragraph">
+                  <wp:posOffset>3115733</wp:posOffset>
+                </wp:positionV>
+                <wp:extent cx="812800" cy="414867"/>
+                <wp:effectExtent l="0" t="0" r="25400" b="23495"/>
+                <wp:wrapNone/>
+                <wp:docPr id="1928255820" name="Rectangle 37"/>
+                <wp:cNvGraphicFramePr/>
+                <a:graphic xmlns:a="http://schemas.openxmlformats.org/drawingml/2006/main">
+                  <a:graphicData uri="http://schemas.microsoft.com/office/word/2010/wordprocessingShape">
+                    <wps:wsp>
+                      <wps:cNvSpPr/>
+                      <wps:spPr>
+                        <a:xfrm>
+                          <a:off x="0" y="0"/>
+                          <a:ext cx="812800" cy="414867"/>
+                        </a:xfrm>
+                        <a:prstGeom prst="rect">
+                          <a:avLst/>
+                        </a:prstGeom>
+                      </wps:spPr>
+                      <wps:style>
+                        <a:lnRef idx="2">
+                          <a:schemeClr val="accent1">
+                            <a:shade val="15000"/>
+                          </a:schemeClr>
+                        </a:lnRef>
+                        <a:fillRef idx="1">
+                          <a:schemeClr val="accent1"/>
+                        </a:fillRef>
+                        <a:effectRef idx="0">
+                          <a:schemeClr val="accent1"/>
+                        </a:effectRef>
+                        <a:fontRef idx="minor">
+                          <a:schemeClr val="lt1"/>
+                        </a:fontRef>
+                      </wps:style>
+                      <wps:bodyPr rot="0" spcFirstLastPara="0" vertOverflow="overflow" horzOverflow="overflow" vert="horz" wrap="square" lIns="91440" tIns="45720" rIns="91440" bIns="45720" numCol="1" spcCol="0" rtlCol="0" fromWordArt="0" anchor="ctr" anchorCtr="0" forceAA="0" compatLnSpc="1">
+                        <a:prstTxWarp prst="textNoShape">
+                          <a:avLst/>
+                        </a:prstTxWarp>
+                        <a:noAutofit/>
+                      </wps:bodyPr>
+                    </wps:wsp>
+                  </a:graphicData>
+                </a:graphic>
+              </wp:anchor>
+            </w:drawing>
+          </mc:Choice>
+          <mc:Fallback>
+            <w:pict>
+              <v:rect w14:anchorId="1D757161" id="Rectangle 37" o:spid="_x0000_s1026" style="position:absolute;margin-left:124.65pt;margin-top:245.35pt;width:64pt;height:32.65pt;z-index:251706368;visibility:visible;mso-wrap-style:square;mso-wrap-distance-left:9pt;mso-wrap-distance-top:0;mso-wrap-distance-right:9pt;mso-wrap-distance-bottom:0;mso-position-horizontal:absolute;mso-position-horizontal-relative:text;mso-position-vertical:absolute;mso-position-vertical-relative:text;v-text-anchor:middle" o:gfxdata="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" fillcolor="#156082 [3204]" strokecolor="#030e13 [484]" strokeweight="1.5pt"/>
+            </w:pict>
+          </mc:Fallback>
+        </mc:AlternateContent>
+      </w:r>
+      <w:r>
+        <w:rPr>
+          <w:noProof/>
+        </w:rPr>
+        <mc:AlternateContent>
+          <mc:Choice Requires="wps">
+            <w:drawing>
+              <wp:anchor distT="0" distB="0" distL="114300" distR="114300" simplePos="0" relativeHeight="251705344" behindDoc="0" locked="0" layoutInCell="1" allowOverlap="1" wp14:anchorId="51468B31" wp14:editId="31E65DC7">
+                <wp:simplePos x="0" y="0"/>
+                <wp:positionH relativeFrom="column">
+                  <wp:posOffset>1943100</wp:posOffset>
+                </wp:positionH>
+                <wp:positionV relativeFrom="paragraph">
+                  <wp:posOffset>1540721</wp:posOffset>
+                </wp:positionV>
+                <wp:extent cx="25400" cy="1549611"/>
+                <wp:effectExtent l="76200" t="0" r="69850" b="50800"/>
+                <wp:wrapNone/>
+                <wp:docPr id="1897937133" name="Straight Arrow Connector 36"/>
+                <wp:cNvGraphicFramePr/>
+                <a:graphic xmlns:a="http://schemas.openxmlformats.org/drawingml/2006/main">
+                  <a:graphicData uri="http://schemas.microsoft.com/office/word/2010/wordprocessingShape">
+                    <wps:wsp>
+                      <wps:cNvCnPr/>
+                      <wps:spPr>
+                        <a:xfrm flipH="1">
+                          <a:off x="0" y="0"/>
+                          <a:ext cx="25400" cy="1549611"/>
+                        </a:xfrm>
+                        <a:prstGeom prst="straightConnector1">
+                          <a:avLst/>
+                        </a:prstGeom>
+                        <a:ln>
+                          <a:tailEnd type="triangle"/>
+                        </a:ln>
+                      </wps:spPr>
+                      <wps:style>
+                        <a:lnRef idx="2">
+                          <a:schemeClr val="dk1"/>
+                        </a:lnRef>
+                        <a:fillRef idx="0">
+                          <a:schemeClr val="dk1"/>
+                        </a:fillRef>
+                        <a:effectRef idx="1">
+                          <a:schemeClr val="dk1"/>
+                        </a:effectRef>
+                        <a:fontRef idx="minor">
+                          <a:schemeClr val="tx1"/>
+                        </a:fontRef>
+                      </wps:style>
+                      <wps:bodyPr/>
+                    </wps:wsp>
+                  </a:graphicData>
+                </a:graphic>
+              </wp:anchor>
+            </w:drawing>
+          </mc:Choice>
+          <mc:Fallback>
+            <w:pict>
+              <v:shape w14:anchorId="49818138" id="Straight Arrow Connector 36" o:spid="_x0000_s1026" type="#_x0000_t32" style="position:absolute;margin-left:153pt;margin-top:121.3pt;width:2pt;height:122pt;flip:x;z-index:251705344;visibility:visible;mso-wrap-style:square;mso-wrap-distance-left:9pt;mso-wrap-distance-top:0;mso-wrap-distance-right:9pt;mso-wrap-distance-bottom:0;mso-position-horizontal:absolute;mso-position-horizontal-relative:text;mso-position-vertical:absolute;mso-position-vertical-relative:text" o:gfxdata="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" strokecolor="black [3200]" strokeweight="1.5pt">
+                <v:stroke endarrow="block" joinstyle="miter"/>
+              </v:shape>
+            </w:pict>
+          </mc:Fallback>
+        </mc:AlternateContent>
+      </w:r>
+      <w:r>
+        <w:rPr>
+          <w:noProof/>
+        </w:rPr>
+        <mc:AlternateContent>
+          <mc:Choice Requires="wps">
+            <w:drawing>
+              <wp:anchor distT="0" distB="0" distL="114300" distR="114300" simplePos="0" relativeHeight="251704320" behindDoc="0" locked="0" layoutInCell="1" allowOverlap="1" wp14:anchorId="6753F215" wp14:editId="60C9BA01">
+                <wp:simplePos x="0" y="0"/>
+                <wp:positionH relativeFrom="column">
+                  <wp:posOffset>3242733</wp:posOffset>
+                </wp:positionH>
+                <wp:positionV relativeFrom="paragraph">
+                  <wp:posOffset>1718733</wp:posOffset>
+                </wp:positionV>
+                <wp:extent cx="1223434" cy="249767"/>
+                <wp:effectExtent l="38100" t="0" r="15240" b="74295"/>
+                <wp:wrapNone/>
+                <wp:docPr id="1156296747" name="Straight Arrow Connector 35"/>
+                <wp:cNvGraphicFramePr/>
+                <a:graphic xmlns:a="http://schemas.openxmlformats.org/drawingml/2006/main">
+                  <a:graphicData uri="http://schemas.microsoft.com/office/word/2010/wordprocessingShape">
+                    <wps:wsp>
+                      <wps:cNvCnPr/>
+                      <wps:spPr>
+                        <a:xfrm flipH="1">
+                          <a:off x="0" y="0"/>
+                          <a:ext cx="1223434" cy="249767"/>
+                        </a:xfrm>
+                        <a:prstGeom prst="straightConnector1">
+                          <a:avLst/>
+                        </a:prstGeom>
+                        <a:ln>
+                          <a:tailEnd type="triangle"/>
+                        </a:ln>
+                      </wps:spPr>
+                      <wps:style>
+                        <a:lnRef idx="1">
+                          <a:schemeClr val="accent6"/>
+                        </a:lnRef>
+                        <a:fillRef idx="0">
+                          <a:schemeClr val="accent6"/>
+                        </a:fillRef>
+                        <a:effectRef idx="0">
+                          <a:schemeClr val="accent6"/>
+                        </a:effectRef>
+                        <a:fontRef idx="minor">
+                          <a:schemeClr val="tx1"/>
+                        </a:fontRef>
+                      </wps:style>
+                      <wps:bodyPr/>
+                    </wps:wsp>
+                  </a:graphicData>
+                </a:graphic>
+              </wp:anchor>
+            </w:drawing>
+          </mc:Choice>
+          <mc:Fallback>
+            <w:pict>
+              <v:shape w14:anchorId="3B3BB93D" id="Straight Arrow Connector 35" o:spid="_x0000_s1026" type="#_x0000_t32" style="position:absolute;margin-left:255.35pt;margin-top:135.35pt;width:96.35pt;height:19.65pt;flip:x;z-index:251704320;visibility:visible;mso-wrap-style:square;mso-wrap-distance-left:9pt;mso-wrap-distance-top:0;mso-wrap-distance-right:9pt;mso-wrap-distance-bottom:0;mso-position-horizontal:absolute;mso-position-horizontal-relative:text;mso-position-vertical:absolute;mso-position-vertical-relative:text" o:gfxdata="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" strokecolor="#4ea72e [3209]" strokeweight="1pt">
+                <v:stroke endarrow="block" joinstyle="miter"/>
+              </v:shape>
+            </w:pict>
+          </mc:Fallback>
+        </mc:AlternateContent>
+      </w:r>
+      <w:r>
+        <w:rPr>
+          <w:noProof/>
+        </w:rPr>
+        <mc:AlternateContent>
+          <mc:Choice Requires="wps">
+            <w:drawing>
+              <wp:anchor distT="0" distB="0" distL="114300" distR="114300" simplePos="0" relativeHeight="251703296" behindDoc="0" locked="0" layoutInCell="1" allowOverlap="1" wp14:anchorId="11DCF623" wp14:editId="79F3D6B9">
+                <wp:simplePos x="0" y="0"/>
+                <wp:positionH relativeFrom="column">
+                  <wp:posOffset>2815167</wp:posOffset>
+                </wp:positionH>
+                <wp:positionV relativeFrom="paragraph">
+                  <wp:posOffset>-16933</wp:posOffset>
+                </wp:positionV>
+                <wp:extent cx="740833" cy="59266"/>
+                <wp:effectExtent l="0" t="57150" r="21590" b="36195"/>
+                <wp:wrapNone/>
+                <wp:docPr id="450262099" name="Straight Arrow Connector 34"/>
+                <wp:cNvGraphicFramePr/>
+                <a:graphic xmlns:a="http://schemas.openxmlformats.org/drawingml/2006/main">
+                  <a:graphicData uri="http://schemas.microsoft.com/office/word/2010/wordprocessingShape">
+                    <wps:wsp>
+                      <wps:cNvCnPr/>
+                      <wps:spPr>
+                        <a:xfrm flipV="1">
+                          <a:off x="0" y="0"/>
+                          <a:ext cx="740833" cy="59266"/>
+                        </a:xfrm>
+                        <a:prstGeom prst="straightConnector1">
+                          <a:avLst/>
+                        </a:prstGeom>
+                        <a:ln>
+                          <a:tailEnd type="triangle"/>
+                        </a:ln>
+                      </wps:spPr>
+                      <wps:style>
+                        <a:lnRef idx="1">
+                          <a:schemeClr val="accent6"/>
+                        </a:lnRef>
+                        <a:fillRef idx="0">
+                          <a:schemeClr val="accent6"/>
+                        </a:fillRef>
+                        <a:effectRef idx="0">
+                          <a:schemeClr val="accent6"/>
+                        </a:effectRef>
+                        <a:fontRef idx="minor">
+                          <a:schemeClr val="tx1"/>
+                        </a:fontRef>
+                      </wps:style>
+                      <wps:bodyPr/>
+                    </wps:wsp>
+                  </a:graphicData>
+                </a:graphic>
+              </wp:anchor>
+            </w:drawing>
+          </mc:Choice>
+          <mc:Fallback>
+            <w:pict>
+              <v:shape w14:anchorId="0C48EAD8" id="Straight Arrow Connector 34" o:spid="_x0000_s1026" type="#_x0000_t32" style="position:absolute;margin-left:221.65pt;margin-top:-1.35pt;width:58.35pt;height:4.65pt;flip:y;z-index:251703296;visibility:visible;mso-wrap-style:square;mso-wrap-distance-left:9pt;mso-wrap-distance-top:0;mso-wrap-distance-right:9pt;mso-wrap-distance-bottom:0;mso-position-horizontal:absolute;mso-position-horizontal-relative:text;mso-position-vertical:absolute;mso-position-vertical-relative:text" o:gfxdata="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" strokecolor="#4ea72e [3209]" strokeweight="1pt">
+                <v:stroke endarrow="block" joinstyle="miter"/>
+              </v:shape>
+            </w:pict>
+          </mc:Fallback>
+        </mc:AlternateContent>
+      </w:r>
       <w:r>
         <w:rPr>
           <w:noProof/>
@@ -157,7 +1935,7 @@
           </mc:Choice>
           <mc:Fallback>
             <w:pict>
-              <v:rect w14:anchorId="72696F4B" id="Rectangle 22" o:spid="_x0000_s1026" style="position:absolute;margin-left:203.35pt;margin-top:106.35pt;width:56.35pt;height:23.35pt;z-index:251701248;visibility:visible;mso-wrap-style:square;mso-width-percent:0;mso-wrap-distance-left:9pt;mso-wrap-distance-top:0;mso-wrap-distance-right:9pt;mso-wrap-distance-bottom:0;mso-position-horizontal:absolute;mso-position-horizontal-relative:text;mso-position-vertical:absolute;mso-position-vertical-relative:text;mso-width-percent:0;mso-width-relative:margin;v-text-anchor:middle" o:gfxdata="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" fillcolor="#bf4e14 [2405]" strokecolor="#030e13 [484]" strokeweight="1.5pt">
+              <v:rect w14:anchorId="72696F4B" id="Rectangle 22" o:spid="_x0000_s1029" style="position:absolute;margin-left:203.35pt;margin-top:106.35pt;width:56.35pt;height:23.35pt;z-index:251701248;visibility:visible;mso-wrap-style:square;mso-width-percent:0;mso-wrap-distance-left:9pt;mso-wrap-distance-top:0;mso-wrap-distance-right:9pt;mso-wrap-distance-bottom:0;mso-position-horizontal:absolute;mso-position-horizontal-relative:text;mso-position-vertical:absolute;mso-position-vertical-relative:text;mso-width-percent:0;mso-width-relative:margin;v-text-anchor:middle" o:gfxdata="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" fillcolor="#bf4e14 [2405]" strokecolor="#030e13 [484]" strokeweight="1.5pt">
                 <v:textbox>
                   <w:txbxContent>
                     <w:p>
@@ -552,7 +2330,7 @@
           </mc:Choice>
           <mc:Fallback>
             <w:pict>
-              <v:roundrect w14:anchorId="229A036C" id="Rectangle: Rounded Corners 20" o:spid="_x0000_s1027" style="position:absolute;margin-left:199.65pt;margin-top:78.35pt;width:41.65pt;height:22.65pt;z-index:251699200;visibility:visible;mso-wrap-style:square;mso-height-percent:0;mso-wrap-distance-left:9pt;mso-wrap-distance-top:0;mso-wrap-distance-right:9pt;mso-wrap-distance-bottom:0;mso-position-horizontal:absolute;mso-position-horizontal-relative:text;mso-position-vertical:absolute;mso-position-vertical-relative:text;mso-height-percent:0;mso-height-relative:margin;v-text-anchor:middle" arcsize="10923f" o:gfxdata="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" fillcolor="#393939 [814]" strokecolor="#030e13 [484]" strokeweight="1.5pt">
+              <v:roundrect w14:anchorId="229A036C" id="Rectangle: Rounded Corners 20" o:spid="_x0000_s1030" style="position:absolute;margin-left:199.65pt;margin-top:78.35pt;width:41.65pt;height:22.65pt;z-index:251699200;visibility:visible;mso-wrap-style:square;mso-height-percent:0;mso-wrap-distance-left:9pt;mso-wrap-distance-top:0;mso-wrap-distance-right:9pt;mso-wrap-distance-bottom:0;mso-position-horizontal:absolute;mso-position-horizontal-relative:text;mso-position-vertical:absolute;mso-position-vertical-relative:text;mso-height-percent:0;mso-height-relative:margin;v-text-anchor:middle" arcsize="10923f" o:gfxdata="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" fillcolor="#393939 [814]" strokecolor="#030e13 [484]" strokeweight="1.5pt">
                 <v:stroke joinstyle="miter"/>
                 <v:textbox>
                   <w:txbxContent>
@@ -927,7 +2705,7 @@
         <mc:AlternateContent>
           <mc:Choice Requires="wps">
             <w:drawing>
-              <wp:anchor distT="0" distB="0" distL="114300" distR="114300" simplePos="0" relativeHeight="251696128" behindDoc="0" locked="0" layoutInCell="1" allowOverlap="1" wp14:anchorId="445C00E6" wp14:editId="3900FF47">
+              <wp:anchor distT="0" distB="0" distL="114300" distR="114300" simplePos="0" relativeHeight="251696128" behindDoc="0" locked="0" layoutInCell="1" allowOverlap="1" wp14:anchorId="445C00E6" wp14:editId="11C58A12">
                 <wp:simplePos x="0" y="0"/>
                 <wp:positionH relativeFrom="column">
                   <wp:posOffset>118533</wp:posOffset>
@@ -975,6 +2753,18 @@
                           <a:schemeClr val="lt1"/>
                         </a:fontRef>
                       </wps:style>
+                      <wps:txbx>
+                        <w:txbxContent>
+                          <w:p>
+                            <w:pPr>
+                              <w:jc w:val="center"/>
+                            </w:pPr>
+                            <w:r>
+                              <w:t>Home</w:t>
+                            </w:r>
+                          </w:p>
+                        </w:txbxContent>
+                      </wps:txbx>
                       <wps:bodyPr rot="0" spcFirstLastPara="0" vertOverflow="overflow" horzOverflow="overflow" vert="horz" wrap="square" lIns="91440" tIns="45720" rIns="91440" bIns="45720" numCol="1" spcCol="0" rtlCol="0" fromWordArt="0" anchor="ctr" anchorCtr="0" forceAA="0" compatLnSpc="1">
                         <a:prstTxWarp prst="textNoShape">
                           <a:avLst/>
@@ -989,7 +2779,20 @@
           </mc:Choice>
           <mc:Fallback>
             <w:pict>
-              <v:rect w14:anchorId="44EC94CE" id="Rectangle 16" o:spid="_x0000_s1026" style="position:absolute;margin-left:9.35pt;margin-top:15pt;width:98.35pt;height:58pt;z-index:251696128;visibility:visible;mso-wrap-style:square;mso-wrap-distance-left:9pt;mso-wrap-distance-top:0;mso-wrap-distance-right:9pt;mso-wrap-distance-bottom:0;mso-position-horizontal:absolute;mso-position-horizontal-relative:text;mso-position-vertical:absolute;mso-position-vertical-relative:text;v-text-anchor:middle" o:gfxdata="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" fillcolor="#4e95d9 [1631]" strokecolor="#030e13 [484]" strokeweight="1.5pt"/>
+              <v:rect w14:anchorId="445C00E6" id="Rectangle 16" o:spid="_x0000_s1031" style="position:absolute;margin-left:9.35pt;margin-top:15pt;width:98.35pt;height:58pt;z-index:251696128;visibility:visible;mso-wrap-style:square;mso-wrap-distance-left:9pt;mso-wrap-distance-top:0;mso-wrap-distance-right:9pt;mso-wrap-distance-bottom:0;mso-position-horizontal:absolute;mso-position-horizontal-relative:text;mso-position-vertical:absolute;mso-position-vertical-relative:text;v-text-anchor:middle" o:gfxdata="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" fillcolor="#4e95d9 [1631]" strokecolor="#030e13 [484]" strokeweight="1.5pt">
+                <v:textbox>
+                  <w:txbxContent>
+                    <w:p>
+                      <w:pPr>
+                        <w:jc w:val="center"/>
+                      </w:pPr>
+                      <w:r>
+                        <w:t>Home</w:t>
+                      </w:r>
+                    </w:p>
+                  </w:txbxContent>
+                </v:textbox>
+              </v:rect>
             </w:pict>
           </mc:Fallback>
         </mc:AlternateContent>
@@ -1081,7 +2884,7 @@
           </mc:Choice>
           <mc:Fallback>
             <w:pict>
-              <v:rect w14:anchorId="44803B6A" id="Rectangle 13" o:spid="_x0000_s1028" style="position:absolute;margin-left:109.95pt;margin-top:140.3pt;width:70.65pt;height:21.65pt;z-index:251691008;visibility:visible;mso-wrap-style:square;mso-width-percent:0;mso-height-percent:0;mso-wrap-distance-left:9pt;mso-wrap-distance-top:0;mso-wrap-distance-right:9pt;mso-wrap-distance-bottom:0;mso-position-horizontal:absolute;mso-position-horizontal-relative:text;mso-position-vertical:absolute;mso-position-vertical-relative:text;mso-width-percent:0;mso-height-percent:0;mso-width-relative:margin;mso-height-relative:margin;v-text-anchor:middle" o:gfxdata="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" fillcolor="#45b0e1 [1940]" strokecolor="#030e13 [484]" strokeweight="1.5pt">
+              <v:rect w14:anchorId="44803B6A" id="Rectangle 13" o:spid="_x0000_s1032" style="position:absolute;margin-left:109.95pt;margin-top:140.3pt;width:70.65pt;height:21.65pt;z-index:251691008;visibility:visible;mso-wrap-style:square;mso-width-percent:0;mso-height-percent:0;mso-wrap-distance-left:9pt;mso-wrap-distance-top:0;mso-wrap-distance-right:9pt;mso-wrap-distance-bottom:0;mso-position-horizontal:absolute;mso-position-horizontal-relative:text;mso-position-vertical:absolute;mso-position-vertical-relative:text;mso-width-percent:0;mso-height-percent:0;mso-width-relative:margin;mso-height-relative:margin;v-text-anchor:middle" o:gfxdata="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" fillcolor="#45b0e1 [1940]" strokecolor="#030e13 [484]" strokeweight="1.5pt">
                 <v:textbox>
                   <w:txbxContent>
                     <w:p>
@@ -1329,7 +3132,7 @@
           </mc:Choice>
           <mc:Fallback>
             <w:pict>
-              <v:oval w14:anchorId="54685006" id="Oval 2" o:spid="_x0000_s1029" style="position:absolute;margin-left:274.95pt;margin-top:27.3pt;width:53.65pt;height:40.35pt;z-index:251660288;visibility:visible;mso-wrap-style:square;mso-width-percent:0;mso-wrap-distance-left:9pt;mso-wrap-distance-top:0;mso-wrap-distance-right:9pt;mso-wrap-distance-bottom:0;mso-position-horizontal:absolute;mso-position-horizontal-relative:text;mso-position-vertical:absolute;mso-position-vertical-relative:text;mso-width-percent:0;mso-width-relative:margin;v-text-anchor:middle" o:gfxdata="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" fillcolor="#45b0e1 [1940]" strokecolor="#030e13 [484]" strokeweight="1.5pt">
+              <v:oval w14:anchorId="54685006" id="Oval 2" o:spid="_x0000_s1033" style="position:absolute;margin-left:274.95pt;margin-top:27.3pt;width:53.65pt;height:40.35pt;z-index:251660288;visibility:visible;mso-wrap-style:square;mso-width-percent:0;mso-wrap-distance-left:9pt;mso-wrap-distance-top:0;mso-wrap-distance-right:9pt;mso-wrap-distance-bottom:0;mso-position-horizontal:absolute;mso-position-horizontal-relative:text;mso-position-vertical:absolute;mso-position-vertical-relative:text;mso-width-percent:0;mso-width-relative:margin;v-text-anchor:middle" o:gfxdata="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" fillcolor="#45b0e1 [1940]" strokecolor="#030e13 [484]" strokeweight="1.5pt">
                 <v:stroke joinstyle="miter"/>
                 <v:textbox>
                   <w:txbxContent>
@@ -1355,7 +3158,7 @@
         <mc:AlternateContent>
           <mc:Choice Requires="wps">
             <w:drawing>
-              <wp:anchor distT="0" distB="0" distL="114300" distR="114300" simplePos="0" relativeHeight="251661312" behindDoc="0" locked="0" layoutInCell="1" allowOverlap="1" wp14:anchorId="314BDA4E" wp14:editId="54A977B0">
+              <wp:anchor distT="0" distB="0" distL="114300" distR="114300" simplePos="0" relativeHeight="251661312" behindDoc="0" locked="0" layoutInCell="1" allowOverlap="1" wp14:anchorId="314BDA4E" wp14:editId="25B05D39">
                 <wp:simplePos x="0" y="0"/>
                 <wp:positionH relativeFrom="column">
                   <wp:posOffset>4174067</wp:posOffset>
@@ -1414,81 +3217,7 @@
           </mc:Choice>
           <mc:Fallback>
             <w:pict>
-              <v:rect w14:anchorId="09170C00" id="Rectangle 3" o:spid="_x0000_s1026" style="position:absolute;margin-left:328.65pt;margin-top:1.35pt;width:161.3pt;height:95.3pt;z-index:251661312;visibility:visible;mso-wrap-style:square;mso-width-percent:0;mso-wrap-distance-left:9pt;mso-wrap-distance-top:0;mso-wrap-distance-right:9pt;mso-wrap-distance-bottom:0;mso-position-horizontal:absolute;mso-position-horizontal-relative:text;mso-position-vertical:absolute;mso-position-vertical-relative:text;mso-width-percent:0;mso-width-relative:margin;v-text-anchor:middle" o:gfxdata="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" fillcolor="#156082 [3204]" strokecolor="#030e13 [484]" strokeweight="1.5pt"/>
-            </w:pict>
-          </mc:Fallback>
-        </mc:AlternateContent>
-      </w:r>
-      <w:r>
-        <w:rPr>
-          <w:noProof/>
-        </w:rPr>
-        <mc:AlternateContent>
-          <mc:Choice Requires="wps">
-            <w:drawing>
-              <wp:anchor distT="0" distB="0" distL="114300" distR="114300" simplePos="0" relativeHeight="251670528" behindDoc="0" locked="0" layoutInCell="1" allowOverlap="1" wp14:anchorId="0E5CFD27" wp14:editId="3015AFBB">
-                <wp:simplePos x="0" y="0"/>
-                <wp:positionH relativeFrom="column">
-                  <wp:posOffset>-541868</wp:posOffset>
-                </wp:positionH>
-                <wp:positionV relativeFrom="paragraph">
-                  <wp:posOffset>-228601</wp:posOffset>
-                </wp:positionV>
-                <wp:extent cx="3869267" cy="2929467"/>
-                <wp:effectExtent l="0" t="0" r="17145" b="23495"/>
-                <wp:wrapNone/>
-                <wp:docPr id="462035889" name="Rectangle 7"/>
-                <wp:cNvGraphicFramePr/>
-                <a:graphic xmlns:a="http://schemas.openxmlformats.org/drawingml/2006/main">
-                  <a:graphicData uri="http://schemas.microsoft.com/office/word/2010/wordprocessingShape">
-                    <wps:wsp>
-                      <wps:cNvSpPr/>
-                      <wps:spPr>
-                        <a:xfrm>
-                          <a:off x="0" y="0"/>
-                          <a:ext cx="3869267" cy="2929467"/>
-                        </a:xfrm>
-                        <a:prstGeom prst="rect">
-                          <a:avLst/>
-                        </a:prstGeom>
-                      </wps:spPr>
-                      <wps:style>
-                        <a:lnRef idx="2">
-                          <a:schemeClr val="accent1">
-                            <a:shade val="15000"/>
-                          </a:schemeClr>
-                        </a:lnRef>
-                        <a:fillRef idx="1">
-                          <a:schemeClr val="accent1"/>
-                        </a:fillRef>
-                        <a:effectRef idx="0">
-                          <a:schemeClr val="accent1"/>
-                        </a:effectRef>
-                        <a:fontRef idx="minor">
-                          <a:schemeClr val="lt1"/>
-                        </a:fontRef>
-                      </wps:style>
-                      <wps:bodyPr rot="0" spcFirstLastPara="0" vertOverflow="overflow" horzOverflow="overflow" vert="horz" wrap="square" lIns="91440" tIns="45720" rIns="91440" bIns="45720" numCol="1" spcCol="0" rtlCol="0" fromWordArt="0" anchor="ctr" anchorCtr="0" forceAA="0" compatLnSpc="1">
-                        <a:prstTxWarp prst="textNoShape">
-                          <a:avLst/>
-                        </a:prstTxWarp>
-                        <a:noAutofit/>
-                      </wps:bodyPr>
-                    </wps:wsp>
-                  </a:graphicData>
-                </a:graphic>
-                <wp14:sizeRelH relativeFrom="margin">
-                  <wp14:pctWidth>0</wp14:pctWidth>
-                </wp14:sizeRelH>
-                <wp14:sizeRelV relativeFrom="margin">
-                  <wp14:pctHeight>0</wp14:pctHeight>
-                </wp14:sizeRelV>
-              </wp:anchor>
-            </w:drawing>
-          </mc:Choice>
-          <mc:Fallback>
-            <w:pict>
-              <v:rect w14:anchorId="45CD0797" id="Rectangle 7" o:spid="_x0000_s1026" style="position:absolute;margin-left:-42.65pt;margin-top:-18pt;width:304.65pt;height:230.65pt;z-index:251670528;visibility:visible;mso-wrap-style:square;mso-width-percent:0;mso-height-percent:0;mso-wrap-distance-left:9pt;mso-wrap-distance-top:0;mso-wrap-distance-right:9pt;mso-wrap-distance-bottom:0;mso-position-horizontal:absolute;mso-position-horizontal-relative:text;mso-position-vertical:absolute;mso-position-vertical-relative:text;mso-width-percent:0;mso-height-percent:0;mso-width-relative:margin;mso-height-relative:margin;v-text-anchor:middle" o:gfxdata="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" fillcolor="#156082 [3204]" strokecolor="#030e13 [484]" strokeweight="1.5pt"/>
+              <v:rect w14:anchorId="37FC52B1" id="Rectangle 3" o:spid="_x0000_s1026" style="position:absolute;margin-left:328.65pt;margin-top:1.35pt;width:161.3pt;height:95.3pt;z-index:251661312;visibility:visible;mso-wrap-style:square;mso-width-percent:0;mso-wrap-distance-left:9pt;mso-wrap-distance-top:0;mso-wrap-distance-right:9pt;mso-wrap-distance-bottom:0;mso-position-horizontal:absolute;mso-position-horizontal-relative:text;mso-position-vertical:absolute;mso-position-vertical-relative:text;mso-width-percent:0;mso-width-relative:margin;v-text-anchor:middle" o:gfxdata="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" fillcolor="#156082 [3204]" strokecolor="#030e13 [484]" strokeweight="1.5pt"/>
             </w:pict>
           </mc:Fallback>
         </mc:AlternateContent>
@@ -1654,7 +3383,7 @@
           </mc:Choice>
           <mc:Fallback>
             <w:pict>
-              <v:rect w14:anchorId="3FE3F05D" id="Rectangle 6" o:spid="_x0000_s1030" style="position:absolute;margin-left:166.65pt;margin-top:104.35pt;width:29pt;height:28.65pt;z-index:251688960;visibility:visible;mso-wrap-style:square;mso-wrap-distance-left:9pt;mso-wrap-distance-top:0;mso-wrap-distance-right:9pt;mso-wrap-distance-bottom:0;mso-position-horizontal:absolute;mso-position-horizontal-relative:text;mso-position-vertical:absolute;mso-position-vertical-relative:text;v-text-anchor:middle" o:gfxdata="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" fillcolor="#737373 [1614]" strokecolor="#030e13 [484]" strokeweight="1.5pt">
+              <v:rect w14:anchorId="3FE3F05D" id="Rectangle 6" o:spid="_x0000_s1034" style="position:absolute;margin-left:166.65pt;margin-top:104.35pt;width:29pt;height:28.65pt;z-index:251688960;visibility:visible;mso-wrap-style:square;mso-wrap-distance-left:9pt;mso-wrap-distance-top:0;mso-wrap-distance-right:9pt;mso-wrap-distance-bottom:0;mso-position-horizontal:absolute;mso-position-horizontal-relative:text;mso-position-vertical:absolute;mso-position-vertical-relative:text;v-text-anchor:middle" o:gfxdata="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" fillcolor="#737373 [1614]" strokecolor="#030e13 [484]" strokeweight="1.5pt">
                 <v:textbox>
                   <w:txbxContent>
                     <w:p>
@@ -1755,7 +3484,7 @@
         <mc:AlternateContent>
           <mc:Choice Requires="wps">
             <w:drawing>
-              <wp:anchor distT="0" distB="0" distL="114300" distR="114300" simplePos="0" relativeHeight="251686912" behindDoc="0" locked="0" layoutInCell="1" allowOverlap="1" wp14:anchorId="2A994118" wp14:editId="5B6BB424">
+              <wp:anchor distT="0" distB="0" distL="114300" distR="114300" simplePos="0" relativeHeight="251686912" behindDoc="0" locked="0" layoutInCell="1" allowOverlap="1" wp14:anchorId="2A994118" wp14:editId="0CEE1C4B">
                 <wp:simplePos x="0" y="0"/>
                 <wp:positionH relativeFrom="column">
                   <wp:posOffset>1438910</wp:posOffset>
@@ -1828,7 +3557,7 @@
           </mc:Choice>
           <mc:Fallback>
             <w:pict>
-              <v:rect w14:anchorId="2A994118" id="_x0000_s1031" style="position:absolute;margin-left:113.3pt;margin-top:105.95pt;width:29pt;height:28.65pt;z-index:251686912;visibility:visible;mso-wrap-style:square;mso-wrap-distance-left:9pt;mso-wrap-distance-top:0;mso-wrap-distance-right:9pt;mso-wrap-distance-bottom:0;mso-position-horizontal:absolute;mso-position-horizontal-relative:text;mso-position-vertical:absolute;mso-position-vertical-relative:text;v-text-anchor:middle" o:gfxdata="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" fillcolor="#737373 [1614]" strokecolor="#030e13 [484]" strokeweight="1.5pt">
+              <v:rect w14:anchorId="2A994118" id="_x0000_s1035" style="position:absolute;margin-left:113.3pt;margin-top:105.95pt;width:29pt;height:28.65pt;z-index:251686912;visibility:visible;mso-wrap-style:square;mso-wrap-distance-left:9pt;mso-wrap-distance-top:0;mso-wrap-distance-right:9pt;mso-wrap-distance-bottom:0;mso-position-horizontal:absolute;mso-position-horizontal-relative:text;mso-position-vertical:absolute;mso-position-vertical-relative:text;v-text-anchor:middle" o:gfxdata="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" fillcolor="#737373 [1614]" strokecolor="#030e13 [484]" strokeweight="1.5pt">
                 <v:textbox>
                   <w:txbxContent>
                     <w:p>
@@ -2150,7 +3879,7 @@
           </mc:Choice>
           <mc:Fallback>
             <w:pict>
-              <v:rect w14:anchorId="72BCA2B0" id="_x0000_s1032" style="position:absolute;margin-left:388.65pt;margin-top:33.6pt;width:29pt;height:28.65pt;z-index:251666432;visibility:visible;mso-wrap-style:square;mso-wrap-distance-left:9pt;mso-wrap-distance-top:0;mso-wrap-distance-right:9pt;mso-wrap-distance-bottom:0;mso-position-horizontal:absolute;mso-position-horizontal-relative:text;mso-position-vertical:absolute;mso-position-vertical-relative:text;v-text-anchor:middle" o:gfxdata="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" fillcolor="#737373 [1614]" strokecolor="#030e13 [484]" strokeweight="1.5pt">
+              <v:rect w14:anchorId="72BCA2B0" id="_x0000_s1036" style="position:absolute;margin-left:388.65pt;margin-top:33.6pt;width:29pt;height:28.65pt;z-index:251666432;visibility:visible;mso-wrap-style:square;mso-wrap-distance-left:9pt;mso-wrap-distance-top:0;mso-wrap-distance-right:9pt;mso-wrap-distance-bottom:0;mso-position-horizontal:absolute;mso-position-horizontal-relative:text;mso-position-vertical:absolute;mso-position-vertical-relative:text;v-text-anchor:middle" o:gfxdata="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" fillcolor="#737373 [1614]" strokecolor="#030e13 [484]" strokeweight="1.5pt">
                 <v:textbox>
                   <w:txbxContent>
                     <w:p>
@@ -2322,7 +4051,7 @@
           </mc:Choice>
           <mc:Fallback>
             <w:pict>
-              <v:rect w14:anchorId="505886CA" id="_x0000_s1033" style="position:absolute;margin-left:442pt;margin-top:32pt;width:29pt;height:28.65pt;z-index:251669504;visibility:visible;mso-wrap-style:square;mso-wrap-distance-left:9pt;mso-wrap-distance-top:0;mso-wrap-distance-right:9pt;mso-wrap-distance-bottom:0;mso-position-horizontal:absolute;mso-position-horizontal-relative:text;mso-position-vertical:absolute;mso-position-vertical-relative:text;v-text-anchor:middle" o:gfxdata="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" fillcolor="#737373 [1614]" strokecolor="#030e13 [484]" strokeweight="1.5pt">
+              <v:rect w14:anchorId="505886CA" id="_x0000_s1037" style="position:absolute;margin-left:442pt;margin-top:32pt;width:29pt;height:28.65pt;z-index:251669504;visibility:visible;mso-wrap-style:square;mso-wrap-distance-left:9pt;mso-wrap-distance-top:0;mso-wrap-distance-right:9pt;mso-wrap-distance-bottom:0;mso-position-horizontal:absolute;mso-position-horizontal-relative:text;mso-position-vertical:absolute;mso-position-vertical-relative:text;v-text-anchor:middle" o:gfxdata="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" fillcolor="#737373 [1614]" strokecolor="#030e13 [484]" strokeweight="1.5pt">
                 <v:textbox>
                   <w:txbxContent>
                     <w:p>
@@ -2423,7 +4152,7 @@
         <mc:AlternateContent>
           <mc:Choice Requires="wps">
             <w:drawing>
-              <wp:anchor distT="0" distB="0" distL="114300" distR="114300" simplePos="0" relativeHeight="251674624" behindDoc="0" locked="0" layoutInCell="1" allowOverlap="1" wp14:anchorId="5283E97A" wp14:editId="312C1F03">
+              <wp:anchor distT="0" distB="0" distL="114300" distR="114300" simplePos="0" relativeHeight="251674624" behindDoc="0" locked="0" layoutInCell="1" allowOverlap="1" wp14:anchorId="5283E97A" wp14:editId="4DA5CDB4">
                 <wp:simplePos x="0" y="0"/>
                 <wp:positionH relativeFrom="margin">
                   <wp:align>left</wp:align>
@@ -2485,7 +4214,7 @@
           </mc:Choice>
           <mc:Fallback>
             <w:pict>
-              <v:rect w14:anchorId="0A2A19A8" id="Rectangle 6" o:spid="_x0000_s1026" style="position:absolute;margin-left:0;margin-top:4pt;width:119.35pt;height:83.65pt;z-index:251674624;visibility:visible;mso-wrap-style:square;mso-width-percent:0;mso-height-percent:0;mso-wrap-distance-left:9pt;mso-wrap-distance-top:0;mso-wrap-distance-right:9pt;mso-wrap-distance-bottom:0;mso-position-horizontal:left;mso-position-horizontal-relative:margin;mso-position-vertical:absolute;mso-position-vertical-relative:text;mso-width-percent:0;mso-height-percent:0;mso-width-relative:margin;mso-height-relative:margin;v-text-anchor:middle" o:gfxdata="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" fillcolor="#156082 [3204]" strokecolor="#030e13 [484]" strokeweight="1.5pt">
+              <v:rect w14:anchorId="48C5DC03" id="Rectangle 6" o:spid="_x0000_s1026" style="position:absolute;margin-left:0;margin-top:4pt;width:119.35pt;height:83.65pt;z-index:251674624;visibility:visible;mso-wrap-style:square;mso-width-percent:0;mso-height-percent:0;mso-wrap-distance-left:9pt;mso-wrap-distance-top:0;mso-wrap-distance-right:9pt;mso-wrap-distance-bottom:0;mso-position-horizontal:left;mso-position-horizontal-relative:margin;mso-position-vertical:absolute;mso-position-vertical-relative:text;mso-width-percent:0;mso-height-percent:0;mso-width-relative:margin;mso-height-relative:margin;v-text-anchor:middle" o:gfxdata="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" fillcolor="#156082 [3204]" strokecolor="#030e13 [484]" strokeweight="1.5pt">
                 <w10:wrap anchorx="margin"/>
               </v:rect>
             </w:pict>
@@ -2537,10 +4266,10 @@
                         <w:txbxContent>
                           <w:p>
                             <w:r>
-                              <w:t>http://localhost:4000/pmsapp/products</w:t>
+                              <w:t>http://localhost:4000/</w:t>
                             </w:r>
                             <w:r>
-                              <w:t>/add</w:t>
+                              <w:t>products</w:t>
                             </w:r>
                           </w:p>
                         </w:txbxContent>
@@ -2562,19 +4291,15 @@
           </mc:Choice>
           <mc:Fallback>
             <w:pict>
-              <v:shapetype w14:anchorId="5B19D178" id="_x0000_t202" coordsize="21600,21600" o:spt="202" path="m,l,21600r21600,l21600,xe">
-                <v:stroke joinstyle="miter"/>
-                <v:path gradientshapeok="t" o:connecttype="rect"/>
-              </v:shapetype>
-              <v:shape id="Text Box 9" o:spid="_x0000_s1034" type="#_x0000_t202" style="position:absolute;margin-left:-37.65pt;margin-top:-59pt;width:247.35pt;height:30.35pt;z-index:251672576;visibility:visible;mso-wrap-style:square;mso-width-percent:0;mso-wrap-distance-left:9pt;mso-wrap-distance-top:0;mso-wrap-distance-right:9pt;mso-wrap-distance-bottom:0;mso-position-horizontal:absolute;mso-position-horizontal-relative:text;mso-position-vertical:absolute;mso-position-vertical-relative:text;mso-width-percent:0;mso-width-relative:margin;v-text-anchor:top" o:gfxdata="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" fillcolor="white [3201]" strokeweight=".5pt">
+              <v:shape w14:anchorId="5B19D178" id="Text Box 9" o:spid="_x0000_s1038" type="#_x0000_t202" style="position:absolute;margin-left:-37.65pt;margin-top:-59pt;width:247.35pt;height:30.35pt;z-index:251672576;visibility:visible;mso-wrap-style:square;mso-width-percent:0;mso-wrap-distance-left:9pt;mso-wrap-distance-top:0;mso-wrap-distance-right:9pt;mso-wrap-distance-bottom:0;mso-position-horizontal:absolute;mso-position-horizontal-relative:text;mso-position-vertical:absolute;mso-position-vertical-relative:text;mso-width-percent:0;mso-width-relative:margin;v-text-anchor:top" o:gfxdata="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" fillcolor="white [3201]" strokeweight=".5pt">
                 <v:textbox>
                   <w:txbxContent>
                     <w:p>
                       <w:r>
-                        <w:t>http://localhost:4000/pmsapp/products</w:t>
+                        <w:t>http://localhost:4000/</w:t>
                       </w:r>
                       <w:r>
-                        <w:t>/add</w:t>
+                        <w:t>products</w:t>
                       </w:r>
                     </w:p>
                   </w:txbxContent>
@@ -3068,7 +4793,7 @@
   <w:style w:type="paragraph" w:default="1" w:styleId="Normal">
     <w:name w:val="Normal"/>
     <w:qFormat/>
-    <w:rsid w:val="00CF4C45"/>
+    <w:rsid w:val="0059431E"/>
   </w:style>
   <w:style w:type="paragraph" w:styleId="Heading1">
     <w:name w:val="heading 1"/>

</xml_diff>